<commit_message>
see if live letter update
</commit_message>
<xml_diff>
--- a/document/discretionary-trust-changes/templates/FOREIGN_Letter.docx
+++ b/document/discretionary-trust-changes/templates/FOREIGN_Letter.docx
@@ -1,6 +1,6 @@
 
 <file path=word/document.xml><?xml version="1.0" encoding="utf-8"?>
-<w:document xmlns:wpc="http://schemas.microsoft.com/office/word/2010/wordprocessingCanvas" xmlns:cx="http://schemas.microsoft.com/office/drawing/2014/chartex" xmlns:cx1="http://schemas.microsoft.com/office/drawing/2015/9/8/chartex" xmlns:cx2="http://schemas.microsoft.com/office/drawing/2015/10/21/chartex" xmlns:cx3="http://schemas.microsoft.com/office/drawing/2016/5/9/chartex" xmlns:cx4="http://schemas.microsoft.com/office/drawing/2016/5/10/chartex" xmlns:cx5="http://schemas.microsoft.com/office/drawing/2016/5/11/chartex" xmlns:cx6="http://schemas.microsoft.com/office/drawing/2016/5/12/chartex" xmlns:cx7="http://schemas.microsoft.com/office/drawing/2016/5/13/chartex" xmlns:cx8="http://schemas.microsoft.com/office/drawing/2016/5/14/chartex" xmlns:mc="http://schemas.openxmlformats.org/markup-compatibility/2006" xmlns:aink="http://schemas.microsoft.com/office/drawing/2016/ink" xmlns:am3d="http://schemas.microsoft.com/office/drawing/2017/model3d" xmlns:o="urn:schemas-microsoft-com:office:office" xmlns:oel="http://schemas.microsoft.com/office/2019/extlst" xmlns:r="http://schemas.openxmlformats.org/officeDocument/2006/relationships" xmlns:m="http://schemas.openxmlformats.org/officeDocument/2006/math" xmlns:v="urn:schemas-microsoft-com:vml" xmlns:wp14="http://schemas.microsoft.com/office/word/2010/wordprocessingDrawing" xmlns:wp="http://schemas.openxmlformats.org/drawingml/2006/wordprocessingDrawing" xmlns:w10="urn:schemas-microsoft-com:office:word" xmlns:w="http://schemas.openxmlformats.org/wordprocessingml/2006/main" xmlns:w14="http://schemas.microsoft.com/office/word/2010/wordml" xmlns:w15="http://schemas.microsoft.com/office/word/2012/wordml" xmlns:w16cex="http://schemas.microsoft.com/office/word/2018/wordml/cex" xmlns:w16cid="http://schemas.microsoft.com/office/word/2016/wordml/cid" xmlns:w16="http://schemas.microsoft.com/office/word/2018/wordml" xmlns:w16du="http://schemas.microsoft.com/office/word/2023/wordml/word16du" xmlns:w16sdtdh="http://schemas.microsoft.com/office/word/2020/wordml/sdtdatahash" xmlns:w16se="http://schemas.microsoft.com/office/word/2015/wordml/symex" xmlns:wpg="http://schemas.microsoft.com/office/word/2010/wordprocessingGroup" xmlns:wpi="http://schemas.microsoft.com/office/word/2010/wordprocessingInk" xmlns:wne="http://schemas.microsoft.com/office/word/2006/wordml" xmlns:wps="http://schemas.microsoft.com/office/word/2010/wordprocessingShape" mc:Ignorable="w14 w15 w16se w16cid w16 w16cex w16sdtdh wp14">
+<w:document xmlns:wpc="http://schemas.microsoft.com/office/word/2010/wordprocessingCanvas" xmlns:cx="http://schemas.microsoft.com/office/drawing/2014/chartex" xmlns:cx1="http://schemas.microsoft.com/office/drawing/2015/9/8/chartex" xmlns:cx2="http://schemas.microsoft.com/office/drawing/2015/10/21/chartex" xmlns:cx3="http://schemas.microsoft.com/office/drawing/2016/5/9/chartex" xmlns:cx4="http://schemas.microsoft.com/office/drawing/2016/5/10/chartex" xmlns:cx5="http://schemas.microsoft.com/office/drawing/2016/5/11/chartex" xmlns:cx6="http://schemas.microsoft.com/office/drawing/2016/5/12/chartex" xmlns:cx7="http://schemas.microsoft.com/office/drawing/2016/5/13/chartex" xmlns:cx8="http://schemas.microsoft.com/office/drawing/2016/5/14/chartex" xmlns:mc="http://schemas.openxmlformats.org/markup-compatibility/2006" xmlns:aink="http://schemas.microsoft.com/office/drawing/2016/ink" xmlns:am3d="http://schemas.microsoft.com/office/drawing/2017/model3d" xmlns:o="urn:schemas-microsoft-com:office:office" xmlns:oel="http://schemas.microsoft.com/office/2019/extlst" xmlns:r="http://schemas.openxmlformats.org/officeDocument/2006/relationships" xmlns:m="http://schemas.openxmlformats.org/officeDocument/2006/math" xmlns:v="urn:schemas-microsoft-com:vml" xmlns:wp14="http://schemas.microsoft.com/office/word/2010/wordprocessingDrawing" xmlns:wp="http://schemas.openxmlformats.org/drawingml/2006/wordprocessingDrawing" xmlns:w10="urn:schemas-microsoft-com:office:word" xmlns:w="http://schemas.openxmlformats.org/wordprocessingml/2006/main" xmlns:w14="http://schemas.microsoft.com/office/word/2010/wordml" xmlns:w15="http://schemas.microsoft.com/office/word/2012/wordml" xmlns:w16cex="http://schemas.microsoft.com/office/word/2018/wordml/cex" xmlns:w16cid="http://schemas.microsoft.com/office/word/2016/wordml/cid" xmlns:w16="http://schemas.microsoft.com/office/word/2018/wordml" xmlns:w16du="http://schemas.microsoft.com/office/word/2023/wordml/word16du" xmlns:w16sdtdh="http://schemas.microsoft.com/office/word/2020/wordml/sdtdatahash" xmlns:w16sdtfl="http://schemas.microsoft.com/office/word/2024/wordml/sdtformatlock" xmlns:w16se="http://schemas.microsoft.com/office/word/2015/wordml/symex" xmlns:wpg="http://schemas.microsoft.com/office/word/2010/wordprocessingGroup" xmlns:wpi="http://schemas.microsoft.com/office/word/2010/wordprocessingInk" xmlns:wne="http://schemas.microsoft.com/office/word/2006/wordml" xmlns:wps="http://schemas.microsoft.com/office/word/2010/wordprocessingShape" mc:Ignorable="w14 w15 w16se w16cid w16 w16cex w16sdtdh w16sdtfl w16du wp14">
   <w:body>
     <w:p>
       <w:pPr>
@@ -17,25 +17,7 @@
           <w:sz w:val="20"/>
           <w:szCs w:val="20"/>
         </w:rPr>
-        <w:t>Our reference: [[</w:t>
-      </w:r>
-      <w:proofErr w:type="spellStart"/>
-      <w:r>
-        <w:rPr>
-          <w:color w:val="000000" w:themeColor="text1"/>
-          <w:sz w:val="20"/>
-          <w:szCs w:val="20"/>
-        </w:rPr>
-        <w:t>Action_ID</w:t>
-      </w:r>
-      <w:proofErr w:type="spellEnd"/>
-      <w:r>
-        <w:rPr>
-          <w:color w:val="000000" w:themeColor="text1"/>
-          <w:sz w:val="20"/>
-          <w:szCs w:val="20"/>
-        </w:rPr>
-        <w:t>]]</w:t>
+        <w:t>Our reference: [[Action_ID]]</w:t>
       </w:r>
     </w:p>
     <w:p>
@@ -85,7 +67,7 @@
           <w:noProof/>
           <w:lang w:eastAsia="en-AU"/>
         </w:rPr>
-        <w:t>11 May 2023</w:t>
+        <w:t>15 July 2026</w:t>
       </w:r>
       <w:r>
         <w:rPr>
@@ -152,31 +134,15 @@
           <w:b/>
           <w:i/>
         </w:rPr>
-        <w:t xml:space="preserve">Private, </w:t>
-      </w:r>
-      <w:proofErr w:type="gramStart"/>
-      <w:r>
+        <w:t>Private, confidential and privileged</w:t>
+      </w:r>
+    </w:p>
+    <w:p>
+      <w:pPr>
         <w:rPr>
           <w:b/>
           <w:i/>
         </w:rPr>
-        <w:t>confidential</w:t>
-      </w:r>
-      <w:proofErr w:type="gramEnd"/>
-      <w:r>
-        <w:rPr>
-          <w:b/>
-          <w:i/>
-        </w:rPr>
-        <w:t xml:space="preserve"> and privileged</w:t>
-      </w:r>
-    </w:p>
-    <w:p>
-      <w:pPr>
-        <w:rPr>
-          <w:b/>
-          <w:i/>
-        </w:rPr>
       </w:pPr>
     </w:p>
     <w:p>
@@ -191,23 +157,7 @@
           <w:bCs/>
           <w:iCs/>
         </w:rPr>
-        <w:t>Dear [[</w:t>
-      </w:r>
-      <w:proofErr w:type="spellStart"/>
-      <w:r>
-        <w:rPr>
-          <w:bCs/>
-          <w:iCs/>
-        </w:rPr>
-        <w:t>letter_salutation</w:t>
-      </w:r>
-      <w:proofErr w:type="spellEnd"/>
-      <w:r>
-        <w:rPr>
-          <w:bCs/>
-          <w:iCs/>
-        </w:rPr>
-        <w:t>]]</w:t>
+        <w:t>Dear [[letter_salutation]]</w:t>
       </w:r>
     </w:p>
     <w:p>
@@ -236,9 +186,8 @@
           <w:i/>
           <w:iCs/>
         </w:rPr>
-        <w:t>[[</w:t>
-      </w:r>
-      <w:proofErr w:type="spellStart"/>
+        <w:t>[[trust_name]]</w:t>
+      </w:r>
       <w:r>
         <w:rPr>
           <w:b/>
@@ -246,25 +195,6 @@
           <w:i/>
           <w:iCs/>
         </w:rPr>
-        <w:t>trust_name</w:t>
-      </w:r>
-      <w:proofErr w:type="spellEnd"/>
-      <w:r>
-        <w:rPr>
-          <w:b/>
-          <w:bCs/>
-          <w:i/>
-          <w:iCs/>
-        </w:rPr>
-        <w:t>]]</w:t>
-      </w:r>
-      <w:r>
-        <w:rPr>
-          <w:b/>
-          <w:bCs/>
-          <w:i/>
-          <w:iCs/>
-        </w:rPr>
         <w:t xml:space="preserve"> (Trust)</w:t>
       </w:r>
     </w:p>
@@ -329,189 +259,69 @@
           <w:rFonts w:asciiTheme="minorHAnsi" w:hAnsiTheme="minorHAnsi" w:cstheme="minorHAnsi"/>
           <w:lang w:eastAsia="en-US"/>
         </w:rPr>
-        <w:t>[[*</w:t>
-      </w:r>
-      <w:proofErr w:type="spellStart"/>
+        <w:t>[[*REPEAT|data_source=trustee|*]] [[*IF {trustee_type|rn=*} == "Company" *]]</w:t>
+      </w:r>
+    </w:p>
+    <w:p>
+      <w:pPr>
+        <w:pStyle w:val="Lettersimplenumbering"/>
+      </w:pPr>
+      <w:r>
+        <w:t xml:space="preserve">Suggested company resolution for the Trustee </w:t>
+      </w:r>
+      <w:r>
+        <w:rPr>
+          <w:lang w:eastAsia="en-US"/>
+        </w:rPr>
+        <w:t xml:space="preserve">– </w:t>
+      </w:r>
       <w:r>
         <w:rPr>
           <w:rFonts w:asciiTheme="minorHAnsi" w:hAnsiTheme="minorHAnsi" w:cstheme="minorHAnsi"/>
           <w:lang w:eastAsia="en-US"/>
         </w:rPr>
-        <w:t>REPEAT|data_source</w:t>
-      </w:r>
-      <w:proofErr w:type="spellEnd"/>
+        <w:t xml:space="preserve">[[trustee_name|rn=*]] </w:t>
+      </w:r>
+      <w:r>
+        <w:rPr>
+          <w:lang w:eastAsia="en-US"/>
+        </w:rPr>
+        <w:t xml:space="preserve"> </w:t>
+      </w:r>
       <w:r>
         <w:rPr>
           <w:rFonts w:asciiTheme="minorHAnsi" w:hAnsiTheme="minorHAnsi" w:cstheme="minorHAnsi"/>
           <w:lang w:eastAsia="en-US"/>
         </w:rPr>
-        <w:t>=trustee|*]] [[*IF {</w:t>
-      </w:r>
-      <w:proofErr w:type="spellStart"/>
+        <w:t xml:space="preserve">[[*ENDIF*]] [[*REPEAT|END*]]  </w:t>
+      </w:r>
       <w:r>
         <w:rPr>
           <w:rFonts w:asciiTheme="minorHAnsi" w:hAnsiTheme="minorHAnsi" w:cstheme="minorHAnsi"/>
           <w:lang w:eastAsia="en-US"/>
         </w:rPr>
-        <w:t>trustee_type|rn</w:t>
-      </w:r>
-      <w:proofErr w:type="spellEnd"/>
+        <w:t>[[*REPEAT|data_source=controller|*]] [[*IF {controller_type|rn=*} == "Company" *]]</w:t>
+      </w:r>
+    </w:p>
+    <w:p>
+      <w:pPr>
+        <w:pStyle w:val="Lettersimplenumbering"/>
+      </w:pPr>
+      <w:r>
+        <w:t xml:space="preserve">Suggested company resolution for the [[trust_controller_name]] </w:t>
+      </w:r>
+      <w:r>
+        <w:rPr>
+          <w:lang w:eastAsia="en-US"/>
+        </w:rPr>
+        <w:t xml:space="preserve">– </w:t>
+      </w:r>
       <w:r>
         <w:rPr>
           <w:rFonts w:asciiTheme="minorHAnsi" w:hAnsiTheme="minorHAnsi" w:cstheme="minorHAnsi"/>
           <w:lang w:eastAsia="en-US"/>
         </w:rPr>
-        <w:t>=*} == "Company" *]]</w:t>
-      </w:r>
-    </w:p>
-    <w:p>
-      <w:pPr>
-        <w:pStyle w:val="Lettersimplenumbering"/>
-      </w:pPr>
-      <w:r>
-        <w:t xml:space="preserve">Suggested company resolution for the Trustee </w:t>
-      </w:r>
-      <w:r>
-        <w:rPr>
-          <w:lang w:eastAsia="en-US"/>
-        </w:rPr>
-        <w:t xml:space="preserve">– </w:t>
-      </w:r>
-      <w:r>
-        <w:rPr>
-          <w:rFonts w:asciiTheme="minorHAnsi" w:hAnsiTheme="minorHAnsi" w:cstheme="minorHAnsi"/>
-          <w:lang w:eastAsia="en-US"/>
-        </w:rPr>
-        <w:t>[[</w:t>
-      </w:r>
-      <w:proofErr w:type="spellStart"/>
-      <w:r>
-        <w:rPr>
-          <w:rFonts w:asciiTheme="minorHAnsi" w:hAnsiTheme="minorHAnsi" w:cstheme="minorHAnsi"/>
-          <w:lang w:eastAsia="en-US"/>
-        </w:rPr>
-        <w:t>trustee_name|rn</w:t>
-      </w:r>
-      <w:proofErr w:type="spellEnd"/>
-      <w:r>
-        <w:rPr>
-          <w:rFonts w:asciiTheme="minorHAnsi" w:hAnsiTheme="minorHAnsi" w:cstheme="minorHAnsi"/>
-          <w:lang w:eastAsia="en-US"/>
-        </w:rPr>
-        <w:t>=*</w:t>
-      </w:r>
-      <w:proofErr w:type="gramStart"/>
-      <w:r>
-        <w:rPr>
-          <w:rFonts w:asciiTheme="minorHAnsi" w:hAnsiTheme="minorHAnsi" w:cstheme="minorHAnsi"/>
-          <w:lang w:eastAsia="en-US"/>
-        </w:rPr>
-        <w:t xml:space="preserve">]] </w:t>
-      </w:r>
-      <w:r>
-        <w:rPr>
-          <w:lang w:eastAsia="en-US"/>
-        </w:rPr>
-        <w:t xml:space="preserve"> </w:t>
-      </w:r>
-      <w:r>
-        <w:rPr>
-          <w:rFonts w:asciiTheme="minorHAnsi" w:hAnsiTheme="minorHAnsi" w:cstheme="minorHAnsi"/>
-          <w:lang w:eastAsia="en-US"/>
-        </w:rPr>
-        <w:t>[</w:t>
-      </w:r>
-      <w:proofErr w:type="gramEnd"/>
-      <w:r>
-        <w:rPr>
-          <w:rFonts w:asciiTheme="minorHAnsi" w:hAnsiTheme="minorHAnsi" w:cstheme="minorHAnsi"/>
-          <w:lang w:eastAsia="en-US"/>
-        </w:rPr>
-        <w:t xml:space="preserve">[*ENDIF*]] [[*REPEAT|END*]]  </w:t>
-      </w:r>
-      <w:r>
-        <w:rPr>
-          <w:rFonts w:asciiTheme="minorHAnsi" w:hAnsiTheme="minorHAnsi" w:cstheme="minorHAnsi"/>
-          <w:lang w:eastAsia="en-US"/>
-        </w:rPr>
-        <w:t>[[*</w:t>
-      </w:r>
-      <w:proofErr w:type="spellStart"/>
-      <w:r>
-        <w:rPr>
-          <w:rFonts w:asciiTheme="minorHAnsi" w:hAnsiTheme="minorHAnsi" w:cstheme="minorHAnsi"/>
-          <w:lang w:eastAsia="en-US"/>
-        </w:rPr>
-        <w:t>REPEAT|data_source</w:t>
-      </w:r>
-      <w:proofErr w:type="spellEnd"/>
-      <w:r>
-        <w:rPr>
-          <w:rFonts w:asciiTheme="minorHAnsi" w:hAnsiTheme="minorHAnsi" w:cstheme="minorHAnsi"/>
-          <w:lang w:eastAsia="en-US"/>
-        </w:rPr>
-        <w:t>=controller|*]] [[*IF {</w:t>
-      </w:r>
-      <w:proofErr w:type="spellStart"/>
-      <w:r>
-        <w:rPr>
-          <w:rFonts w:asciiTheme="minorHAnsi" w:hAnsiTheme="minorHAnsi" w:cstheme="minorHAnsi"/>
-          <w:lang w:eastAsia="en-US"/>
-        </w:rPr>
-        <w:t>controller_type|rn</w:t>
-      </w:r>
-      <w:proofErr w:type="spellEnd"/>
-      <w:r>
-        <w:rPr>
-          <w:rFonts w:asciiTheme="minorHAnsi" w:hAnsiTheme="minorHAnsi" w:cstheme="minorHAnsi"/>
-          <w:lang w:eastAsia="en-US"/>
-        </w:rPr>
-        <w:t>=*} == "Company" *]]</w:t>
-      </w:r>
-    </w:p>
-    <w:p>
-      <w:pPr>
-        <w:pStyle w:val="Lettersimplenumbering"/>
-      </w:pPr>
-      <w:r>
-        <w:t>Suggested company resolution for the [[</w:t>
-      </w:r>
-      <w:proofErr w:type="spellStart"/>
-      <w:r>
-        <w:t>trust_controller_name</w:t>
-      </w:r>
-      <w:proofErr w:type="spellEnd"/>
-      <w:r>
-        <w:t xml:space="preserve">]] </w:t>
-      </w:r>
-      <w:r>
-        <w:rPr>
-          <w:lang w:eastAsia="en-US"/>
-        </w:rPr>
-        <w:t xml:space="preserve">– </w:t>
-      </w:r>
-      <w:r>
-        <w:rPr>
-          <w:rFonts w:asciiTheme="minorHAnsi" w:hAnsiTheme="minorHAnsi" w:cstheme="minorHAnsi"/>
-          <w:lang w:eastAsia="en-US"/>
-        </w:rPr>
-        <w:t>[[</w:t>
-      </w:r>
-      <w:proofErr w:type="spellStart"/>
-      <w:r>
-        <w:rPr>
-          <w:rFonts w:asciiTheme="minorHAnsi" w:hAnsiTheme="minorHAnsi" w:cstheme="minorHAnsi"/>
-          <w:lang w:eastAsia="en-US"/>
-        </w:rPr>
-        <w:t>controller_name|rn</w:t>
-      </w:r>
-      <w:proofErr w:type="spellEnd"/>
-      <w:r>
-        <w:rPr>
-          <w:rFonts w:asciiTheme="minorHAnsi" w:hAnsiTheme="minorHAnsi" w:cstheme="minorHAnsi"/>
-          <w:lang w:eastAsia="en-US"/>
-        </w:rPr>
-        <w:t>=*]]</w:t>
+        <w:t>[[controller_name|rn=*]]</w:t>
       </w:r>
       <w:r>
         <w:t xml:space="preserve"> </w:t>
@@ -580,26 +390,26 @@
         <w:rPr>
           <w:lang w:eastAsia="en-US"/>
         </w:rPr>
-        <w:t xml:space="preserve">Arrange for the documents outlined above to be signed, </w:t>
-      </w:r>
-      <w:proofErr w:type="gramStart"/>
-      <w:r>
+        <w:t>Arrange for the documents outlined above to be signed, witnessed and dated.</w:t>
+      </w:r>
+    </w:p>
+    <w:p>
+      <w:pPr>
+        <w:pStyle w:val="Lettersimplenumbering"/>
         <w:rPr>
           <w:lang w:eastAsia="en-US"/>
         </w:rPr>
-        <w:t>witnessed</w:t>
-      </w:r>
-      <w:proofErr w:type="gramEnd"/>
+      </w:pPr>
       <w:r>
         <w:rPr>
           <w:lang w:eastAsia="en-US"/>
         </w:rPr>
-        <w:t xml:space="preserve"> and dated.</w:t>
-      </w:r>
-    </w:p>
-    <w:p>
-      <w:pPr>
-        <w:pStyle w:val="Lettersimplenumbering"/>
+        <w:t>Retain the original documents with the original trust deed in a secure location (you may wish to make an electronic copy).</w:t>
+      </w:r>
+    </w:p>
+    <w:p>
+      <w:pPr>
+        <w:pStyle w:val="SectionSubheading"/>
         <w:rPr>
           <w:lang w:eastAsia="en-US"/>
         </w:rPr>
@@ -608,7 +418,55 @@
         <w:rPr>
           <w:lang w:eastAsia="en-US"/>
         </w:rPr>
-        <w:t>Retain the original documents with the original trust deed in a secure location (you may wish to make an electronic copy).</w:t>
+        <w:t>Printing</w:t>
+      </w:r>
+    </w:p>
+    <w:p>
+      <w:pPr>
+        <w:rPr>
+          <w:lang w:eastAsia="en-US"/>
+        </w:rPr>
+      </w:pPr>
+      <w:r>
+        <w:rPr>
+          <w:lang w:eastAsia="en-US"/>
+        </w:rPr>
+        <w:t>Please arrange for the documents to be printed and bound at your discretion.</w:t>
+      </w:r>
+    </w:p>
+    <w:p>
+      <w:pPr>
+        <w:rPr>
+          <w:lang w:eastAsia="en-US"/>
+        </w:rPr>
+      </w:pPr>
+      <w:r>
+        <w:rPr>
+          <w:lang w:eastAsia="en-US"/>
+        </w:rPr>
+        <w:lastRenderedPageBreak/>
+        <w:t>The documents can printed single or double sided as you choose.</w:t>
+      </w:r>
+    </w:p>
+    <w:p>
+      <w:pPr>
+        <w:rPr>
+          <w:lang w:eastAsia="en-US"/>
+        </w:rPr>
+      </w:pPr>
+      <w:r>
+        <w:rPr>
+          <w:lang w:eastAsia="en-US"/>
+        </w:rPr>
+        <w:t xml:space="preserve">The documents can be either stapled or bound. </w:t>
+      </w:r>
+    </w:p>
+    <w:p>
+      <w:r>
+        <w:rPr>
+          <w:u w:val="single"/>
+        </w:rPr>
+        <w:t>If all parties are located in Queensland, documents may be executed electronically – and we would be happy to assist with sending any electronic execution links to the relevant signatories.</w:t>
       </w:r>
     </w:p>
     <w:p>
@@ -622,7 +480,7 @@
         <w:rPr>
           <w:lang w:eastAsia="en-US"/>
         </w:rPr>
-        <w:t>Printing</w:t>
+        <w:t>Signing and witnessing</w:t>
       </w:r>
     </w:p>
     <w:p>
@@ -635,97 +493,7 @@
         <w:rPr>
           <w:lang w:eastAsia="en-US"/>
         </w:rPr>
-        <w:t>Please arrange for the documents to be printed and bound at your discretion.</w:t>
-      </w:r>
-    </w:p>
-    <w:p>
-      <w:pPr>
-        <w:rPr>
-          <w:lang w:eastAsia="en-US"/>
-        </w:rPr>
-      </w:pPr>
-      <w:r>
-        <w:rPr>
-          <w:lang w:eastAsia="en-US"/>
-        </w:rPr>
-        <w:t xml:space="preserve">The documents can </w:t>
-      </w:r>
-      <w:proofErr w:type="gramStart"/>
-      <w:r>
-        <w:rPr>
-          <w:lang w:eastAsia="en-US"/>
-        </w:rPr>
-        <w:t>printed</w:t>
-      </w:r>
-      <w:proofErr w:type="gramEnd"/>
-      <w:r>
-        <w:rPr>
-          <w:lang w:eastAsia="en-US"/>
-        </w:rPr>
-        <w:t xml:space="preserve"> single or double sided as you choose.</w:t>
-      </w:r>
-    </w:p>
-    <w:p>
-      <w:pPr>
-        <w:rPr>
-          <w:lang w:eastAsia="en-US"/>
-        </w:rPr>
-      </w:pPr>
-      <w:r>
-        <w:rPr>
-          <w:lang w:eastAsia="en-US"/>
-        </w:rPr>
-        <w:t xml:space="preserve">The documents can be either stapled or bound. </w:t>
-      </w:r>
-    </w:p>
-    <w:p>
-      <w:pPr/>
-      <w:r>
-        <w:rPr>
-          <w:u w:val="single"/>
-        </w:rPr>
-        <w:t>If all parties are located in Queensland, documents may be executed electronically – and we would be happy to assist with sending any electronic execution links to the relevant signatories.</w:t>
-      </w:r>
-    </w:p>
-    <w:p>
-      <w:pPr>
-        <w:pStyle w:val="SectionSubheading"/>
-        <w:rPr>
-          <w:lang w:eastAsia="en-US"/>
-        </w:rPr>
-      </w:pPr>
-      <w:r>
-        <w:rPr>
-          <w:lang w:eastAsia="en-US"/>
-        </w:rPr>
-        <w:t>Signing and witnessing</w:t>
-      </w:r>
-    </w:p>
-    <w:p>
-      <w:pPr>
-        <w:rPr>
-          <w:lang w:eastAsia="en-US"/>
-        </w:rPr>
-      </w:pPr>
-      <w:r>
-        <w:rPr>
-          <w:lang w:eastAsia="en-US"/>
-        </w:rPr>
-        <w:t>Prior to signing, you must ensure all signatories are legally able to sign (</w:t>
-      </w:r>
-      <w:proofErr w:type="gramStart"/>
-      <w:r>
-        <w:rPr>
-          <w:lang w:eastAsia="en-US"/>
-        </w:rPr>
-        <w:t>e.g.</w:t>
-      </w:r>
-      <w:proofErr w:type="gramEnd"/>
-      <w:r>
-        <w:rPr>
-          <w:lang w:eastAsia="en-US"/>
-        </w:rPr>
-        <w:t xml:space="preserve"> individuals have sufficient mental capacity and companies are validly established with appropriate persons appointed as director/secretary).</w:t>
+        <w:t>Prior to signing, you must ensure all signatories are legally able to sign (e.g. individuals have sufficient mental capacity and companies are validly established with appropriate persons appointed as director/secretary).</w:t>
       </w:r>
     </w:p>
     <w:p>
@@ -762,15 +530,7 @@
         </w:numPr>
       </w:pPr>
       <w:r>
-        <w:t xml:space="preserve">Any individuals signing </w:t>
-      </w:r>
-      <w:proofErr w:type="gramStart"/>
-      <w:r>
-        <w:t>in their own right will</w:t>
-      </w:r>
-      <w:proofErr w:type="gramEnd"/>
-      <w:r>
-        <w:t xml:space="preserve"> require a person over the age of 18 </w:t>
+        <w:t xml:space="preserve">Any individuals signing in their own right will require a person over the age of 18 </w:t>
       </w:r>
       <w:r>
         <w:rPr>
@@ -804,11 +564,11 @@
       <w:r>
         <w:t>The original documents should be kept with the original trust deed.</w:t>
       </w:r>
-      <w:bookmarkStart w:id="2" w:name="_Hlk54775283"/>
+      <w:bookmarkStart w:id="0" w:name="_Hlk54775283"/>
       <w:r>
         <w:t xml:space="preserve"> </w:t>
       </w:r>
-      <w:bookmarkEnd w:id="2"/>
+      <w:bookmarkEnd w:id="0"/>
     </w:p>
     <w:p>
       <w:pPr>
@@ -819,22 +579,11 @@
       </w:r>
     </w:p>
     <w:p>
-      <w:pPr>
-        <w:pStyle w:val="Normal"/>
-      </w:pPr>
       <w:r>
         <w:t xml:space="preserve">There is sufficient power to make the Variations pursuant to clause </w:t>
       </w:r>
       <w:r>
-        <w:t>[[</w:t>
-      </w:r>
-      <w:proofErr w:type="spellStart"/>
-      <w:r>
-        <w:t>fe_power</w:t>
-      </w:r>
-      <w:proofErr w:type="spellEnd"/>
-      <w:r>
-        <w:t xml:space="preserve">]] </w:t>
+        <w:t xml:space="preserve">[[fe_power]] </w:t>
       </w:r>
       <w:r>
         <w:t>(</w:t>
@@ -842,7 +591,6 @@
       <w:r>
         <w:rPr>
           <w:b/>
-          <w:bCs w:val="0"/>
         </w:rPr>
         <w:t>Variation Power</w:t>
       </w:r>
@@ -852,7 +600,6 @@
       <w:r>
         <w:rPr>
           <w:b/>
-          <w:bCs w:val="0"/>
         </w:rPr>
         <w:t xml:space="preserve"> </w:t>
       </w:r>
@@ -867,33 +614,16 @@
       </w:r>
     </w:p>
     <w:p>
-      <w:pPr>
-        <w:pStyle w:val="Normal"/>
-      </w:pPr>
-      <w:r>
-        <w:t xml:space="preserve">We have not been asked to provide detailed technical tax advice in relation to the consequences of </w:t>
-      </w:r>
-      <w:proofErr w:type="gramStart"/>
-      <w:r>
-        <w:t>entering into</w:t>
-      </w:r>
-      <w:proofErr w:type="gramEnd"/>
-      <w:r>
-        <w:t xml:space="preserve"> the deed effecting the Variations. </w:t>
-      </w:r>
-    </w:p>
-    <w:p>
-      <w:pPr>
-        <w:pStyle w:val="Normal"/>
-      </w:pPr>
+      <w:r>
+        <w:t xml:space="preserve">We have not been asked to provide detailed technical tax advice in relation to the consequences of entering into the deed effecting the Variations. </w:t>
+      </w:r>
+    </w:p>
+    <w:p>
       <w:r>
         <w:t xml:space="preserve">If you would like a detailed technical advice letter, please let us know, and we would be happy to provide you with a fixed price for such detailed technical advice. </w:t>
       </w:r>
     </w:p>
     <w:p>
-      <w:pPr>
-        <w:pStyle w:val="Normal"/>
-      </w:pPr>
       <w:r>
         <w:t>However, we confirm there should be no adverse income/capital gains tax consequences in entering into the document.</w:t>
       </w:r>
@@ -913,15 +643,7 @@
         </w:numPr>
       </w:pPr>
       <w:r>
-        <w:t xml:space="preserve">the document was prepared pursuant to a valid exercise of the variation power, and accordingly, the Australian Taxation Office has adopted the position under TD 2012/21 that neither CGT event E1 or E2 is </w:t>
-      </w:r>
-      <w:proofErr w:type="gramStart"/>
-      <w:r>
-        <w:t>triggered;</w:t>
-      </w:r>
-      <w:proofErr w:type="gramEnd"/>
-      <w:r>
-        <w:t xml:space="preserve"> </w:t>
+        <w:t xml:space="preserve">the document was prepared pursuant to a valid exercise of the variation power, and accordingly, the Australian Taxation Office has adopted the position under TD 2012/21 that neither CGT event E1 or E2 is triggered; </w:t>
       </w:r>
     </w:p>
     <w:p>
@@ -936,21 +658,10 @@
         <w:t xml:space="preserve">specifically, the Variation Power, allows for the proposed Variation. </w:t>
       </w:r>
       <w:r>
-        <w:t>[[</w:t>
-      </w:r>
-      <w:proofErr w:type="spellStart"/>
-      <w:r>
-        <w:t>fe_valid_power</w:t>
-      </w:r>
-      <w:proofErr w:type="spellEnd"/>
-      <w:r>
-        <w:t>]]</w:t>
-      </w:r>
-    </w:p>
-    <w:p>
-      <w:pPr>
-        <w:pStyle w:val="Normal"/>
-      </w:pPr>
+        <w:t>[[fe_valid_power]]</w:t>
+      </w:r>
+    </w:p>
+    <w:p>
       <w:r>
         <w:t>Therefore, we confirm the above documents are pursuant to a valid exercise of powers under the Trust deed and as a result:</w:t>
       </w:r>
@@ -980,54 +691,31 @@
       </w:r>
     </w:p>
     <w:p>
-      <w:pPr>
-        <w:pStyle w:val="Normal"/>
-      </w:pPr>
       <w:r>
         <w:t>and therefore, no adverse CGT consequences should arise.</w:t>
       </w:r>
     </w:p>
     <w:p>
-      <w:pPr>
-        <w:pStyle w:val="Normal"/>
-      </w:pPr>
-      <w:r>
+      <w:r>
+        <w:lastRenderedPageBreak/>
         <w:t>Steps must be taken to ensure the document does not result in adverse stamp duty consequences.</w:t>
       </w:r>
     </w:p>
     <w:p>
-      <w:pPr>
-        <w:pStyle w:val="Normal"/>
-      </w:pPr>
       <w:r>
         <w:t>Generally, if the Variation does not directly impact a ‘taker in default’, then there should be no stamp duty consequences. Some jurisdictions, however, imposes stamp duty on the changing of a ‘taker in default’.</w:t>
       </w:r>
     </w:p>
     <w:p>
-      <w:pPr>
-        <w:pStyle w:val="Normal"/>
-      </w:pPr>
-      <w:r>
-        <w:t xml:space="preserve">If the core family group of the Trust are entirely based in Australia (and reside in Australia), then a potential amendment to the ‘taker in default’ is unlikely. If, however, some members of the core family group </w:t>
-      </w:r>
-      <w:proofErr w:type="gramStart"/>
-      <w:r>
-        <w:t>resides</w:t>
-      </w:r>
-      <w:proofErr w:type="gramEnd"/>
-      <w:r>
-        <w:t xml:space="preserve"> overseas, then steps must be taken to reach a comfort level that there are no stamp duty consequences in entering into the deed of variation.</w:t>
-      </w:r>
-    </w:p>
-    <w:p>
-      <w:pPr>
-        <w:pStyle w:val="Normal"/>
-      </w:pPr>
+      <w:r>
+        <w:t>If the core family group of the Trust are entirely based in Australia (and reside in Australia), then a potential amendment to the ‘taker in default’ is unlikely. If, however, some members of the core family group resides overseas, then steps must be taken to reach a comfort level that there are no stamp duty consequences in entering into the deed of variation.</w:t>
+      </w:r>
+    </w:p>
+    <w:p>
       <w:r>
         <w:t>If you would like specific advice in relation to such issues, please let us know and we can provide you with a fixed price to assist.</w:t>
       </w:r>
     </w:p>
-    <w:p/>
     <w:p>
       <w:pPr>
         <w:pStyle w:val="SectionHeading"/>
@@ -1045,11 +733,11 @@
       </w:r>
     </w:p>
     <w:p>
-      <w:bookmarkStart w:id="0" w:name="_Hlk54775181"/>
+      <w:bookmarkStart w:id="1" w:name="_Hlk54775181"/>
       <w:r>
         <w:t>We confirm our scope of work is limited to the strict preparation of the deed of variation per the above Variation and confirming the documents comply with the terms of the Trust deed.</w:t>
       </w:r>
-      <w:bookmarkEnd w:id="0"/>
+      <w:bookmarkEnd w:id="1"/>
     </w:p>
     <w:p>
       <w:r>
@@ -1063,15 +751,7 @@
     </w:p>
     <w:p>
       <w:r>
-        <w:t xml:space="preserve">For example, an independent document changing a specific aspect of the Trust may not trigger adverse tax or stamp duty consequences.  However, if such a variation occurs in tandem with various other changes, the </w:t>
-      </w:r>
-      <w:proofErr w:type="gramStart"/>
-      <w:r>
-        <w:t>transaction as a whole, may</w:t>
-      </w:r>
-      <w:proofErr w:type="gramEnd"/>
-      <w:r>
-        <w:t xml:space="preserve"> have an adverse tax or stamp duty consequences.</w:t>
+        <w:t>For example, an independent document changing a specific aspect of the Trust may not trigger adverse tax or stamp duty consequences.  However, if such a variation occurs in tandem with various other changes, the transaction as a whole, may have an adverse tax or stamp duty consequences.</w:t>
       </w:r>
     </w:p>
     <w:p>
@@ -1116,93 +796,56 @@
         </w:numPr>
       </w:pPr>
       <w:r>
-        <w:t xml:space="preserve">estate </w:t>
-      </w:r>
-      <w:proofErr w:type="gramStart"/>
-      <w:r>
-        <w:t>planning;</w:t>
-      </w:r>
-      <w:proofErr w:type="gramEnd"/>
+        <w:t>estate planning;</w:t>
+      </w:r>
     </w:p>
     <w:p>
       <w:pPr>
         <w:pStyle w:val="Letterlevel1"/>
       </w:pPr>
       <w:r>
-        <w:t xml:space="preserve">asset </w:t>
-      </w:r>
-      <w:proofErr w:type="gramStart"/>
-      <w:r>
-        <w:t>protection;</w:t>
-      </w:r>
-      <w:proofErr w:type="gramEnd"/>
+        <w:t>asset protection;</w:t>
+      </w:r>
     </w:p>
     <w:p>
       <w:pPr>
         <w:pStyle w:val="Letterlevel1"/>
       </w:pPr>
       <w:r>
-        <w:t xml:space="preserve">general tax </w:t>
-      </w:r>
-      <w:proofErr w:type="gramStart"/>
-      <w:r>
-        <w:t>planning;</w:t>
-      </w:r>
-      <w:proofErr w:type="gramEnd"/>
+        <w:t>general tax planning;</w:t>
+      </w:r>
     </w:p>
     <w:p>
       <w:pPr>
         <w:pStyle w:val="Letterlevel1"/>
       </w:pPr>
       <w:r>
-        <w:t xml:space="preserve">wider transactions that we have not been informed </w:t>
-      </w:r>
-      <w:proofErr w:type="gramStart"/>
-      <w:r>
-        <w:t>of;</w:t>
-      </w:r>
-      <w:proofErr w:type="gramEnd"/>
+        <w:t>wider transactions that we have not been informed of;</w:t>
+      </w:r>
     </w:p>
     <w:p>
       <w:pPr>
         <w:pStyle w:val="Letterlevel1"/>
       </w:pPr>
       <w:r>
-        <w:t xml:space="preserve">year-end specific trust distribution </w:t>
-      </w:r>
-      <w:proofErr w:type="gramStart"/>
-      <w:r>
-        <w:t>resolutions;</w:t>
-      </w:r>
-      <w:proofErr w:type="gramEnd"/>
+        <w:t>year-end specific trust distribution resolutions;</w:t>
+      </w:r>
     </w:p>
     <w:p>
       <w:pPr>
         <w:pStyle w:val="Letterlevel1"/>
       </w:pPr>
       <w:r>
-        <w:t xml:space="preserve">any general commercial </w:t>
-      </w:r>
-      <w:proofErr w:type="gramStart"/>
-      <w:r>
-        <w:t>issues;</w:t>
-      </w:r>
-      <w:proofErr w:type="gramEnd"/>
+        <w:t>any general commercial issues;</w:t>
+      </w:r>
     </w:p>
     <w:p>
       <w:pPr>
         <w:pStyle w:val="Letterlevel1"/>
       </w:pPr>
       <w:r>
-        <w:t xml:space="preserve">the validity of any structures or appropriateness of any arrangements </w:t>
-      </w:r>
-      <w:proofErr w:type="gramStart"/>
-      <w:r>
-        <w:t>entered into</w:t>
-      </w:r>
-      <w:proofErr w:type="gramEnd"/>
-      <w:r>
-        <w:t xml:space="preserve"> prior to our discussions; or</w:t>
+        <w:lastRenderedPageBreak/>
+        <w:t>the validity of any structures or appropriateness of any arrangements entered into prior to our discussions; or</w:t>
       </w:r>
     </w:p>
     <w:p>
@@ -1215,15 +858,7 @@
     </w:p>
     <w:p>
       <w:r>
-        <w:t xml:space="preserve">A best practice approach would mean that specific advice is obtained on </w:t>
-      </w:r>
-      <w:proofErr w:type="gramStart"/>
-      <w:r>
-        <w:t>these</w:t>
-      </w:r>
-      <w:proofErr w:type="gramEnd"/>
-      <w:r>
-        <w:t xml:space="preserve"> and related issues and we would be happy to assist as you see fit.</w:t>
+        <w:t>A best practice approach would mean that specific advice is obtained on these and related issues and we would be happy to assist as you see fit.</w:t>
       </w:r>
     </w:p>
     <w:p>
@@ -1234,28 +869,12 @@
         </w:rPr>
       </w:pPr>
       <w:r>
-        <w:t xml:space="preserve">As mentioned earlier, although we have taken all steps to consider the tax and stamp duty consequences in </w:t>
-      </w:r>
-      <w:proofErr w:type="gramStart"/>
-      <w:r>
-        <w:t>entering into</w:t>
-      </w:r>
-      <w:proofErr w:type="gramEnd"/>
-      <w:r>
-        <w:t xml:space="preserve"> the above documents, if the documents are part of a larger transaction, we cannot confirm whether the documents in conjunction with other arrangements will cause adverse tax or stamp duty consequences.</w:t>
-      </w:r>
-    </w:p>
-    <w:p>
-      <w:r>
-        <w:t xml:space="preserve">If you would like legal advice in relation to any </w:t>
-      </w:r>
-      <w:proofErr w:type="gramStart"/>
-      <w:r>
-        <w:t>potential</w:t>
-      </w:r>
-      <w:proofErr w:type="gramEnd"/>
-      <w:r>
-        <w:t xml:space="preserve"> relevant issues related to the above documents, please contact us.</w:t>
+        <w:t>As mentioned earlier, although we have taken all steps to consider the tax and stamp duty consequences in entering into the above documents, if the documents are part of a larger transaction, we cannot confirm whether the documents in conjunction with other arrangements will cause adverse tax or stamp duty consequences.</w:t>
+      </w:r>
+    </w:p>
+    <w:p>
+      <w:r>
+        <w:t>If you would like legal advice in relation to any potential relevant issues related to the above documents, please contact us.</w:t>
       </w:r>
     </w:p>
     <w:p>
@@ -1267,7 +886,7 @@
       </w:r>
     </w:p>
     <w:p>
-      <w:bookmarkStart w:id="1" w:name="_Hlk54775270"/>
+      <w:bookmarkStart w:id="2" w:name="_Hlk54775270"/>
       <w:r>
         <w:t xml:space="preserve">Finally, we </w:t>
       </w:r>
@@ -1281,7 +900,7 @@
       <w:r>
         <w:t xml:space="preserve"> our tax invoice in accordance with the agreed fixed price.</w:t>
       </w:r>
-      <w:bookmarkEnd w:id="1"/>
+      <w:bookmarkEnd w:id="2"/>
     </w:p>
     <w:p>
       <w:r>
@@ -1299,7 +918,6 @@
         <w:rPr>
           <w:noProof/>
         </w:rPr>
-        <w:lastRenderedPageBreak/>
         <w:drawing>
           <wp:inline distT="0" distB="0" distL="0" distR="0" wp14:anchorId="1EF64D4E" wp14:editId="6A007097">
             <wp:extent cx="2346709" cy="914400"/>
@@ -1344,12 +962,6 @@
           <w:iCs/>
         </w:rPr>
       </w:pPr>
-      <w:r>
-        <w:rPr>
-          <w:bCs/>
-          <w:iCs/>
-        </w:rPr>
-      </w:r>
     </w:p>
     <w:sectPr>
       <w:headerReference w:type="even" r:id="rId12"/>
@@ -1369,7 +981,7 @@
 </file>
 
 <file path=word/endnotes.xml><?xml version="1.0" encoding="utf-8"?>
-<w:endnotes xmlns:wpc="http://schemas.microsoft.com/office/word/2010/wordprocessingCanvas" xmlns:cx="http://schemas.microsoft.com/office/drawing/2014/chartex" xmlns:cx1="http://schemas.microsoft.com/office/drawing/2015/9/8/chartex" xmlns:cx2="http://schemas.microsoft.com/office/drawing/2015/10/21/chartex" xmlns:cx3="http://schemas.microsoft.com/office/drawing/2016/5/9/chartex" xmlns:cx4="http://schemas.microsoft.com/office/drawing/2016/5/10/chartex" xmlns:cx5="http://schemas.microsoft.com/office/drawing/2016/5/11/chartex" xmlns:cx6="http://schemas.microsoft.com/office/drawing/2016/5/12/chartex" xmlns:cx7="http://schemas.microsoft.com/office/drawing/2016/5/13/chartex" xmlns:cx8="http://schemas.microsoft.com/office/drawing/2016/5/14/chartex" xmlns:mc="http://schemas.openxmlformats.org/markup-compatibility/2006" xmlns:aink="http://schemas.microsoft.com/office/drawing/2016/ink" xmlns:am3d="http://schemas.microsoft.com/office/drawing/2017/model3d" xmlns:o="urn:schemas-microsoft-com:office:office" xmlns:oel="http://schemas.microsoft.com/office/2019/extlst" xmlns:r="http://schemas.openxmlformats.org/officeDocument/2006/relationships" xmlns:m="http://schemas.openxmlformats.org/officeDocument/2006/math" xmlns:v="urn:schemas-microsoft-com:vml" xmlns:wp14="http://schemas.microsoft.com/office/word/2010/wordprocessingDrawing" xmlns:wp="http://schemas.openxmlformats.org/drawingml/2006/wordprocessingDrawing" xmlns:w10="urn:schemas-microsoft-com:office:word" xmlns:w="http://schemas.openxmlformats.org/wordprocessingml/2006/main" xmlns:w14="http://schemas.microsoft.com/office/word/2010/wordml" xmlns:w15="http://schemas.microsoft.com/office/word/2012/wordml" xmlns:w16cex="http://schemas.microsoft.com/office/word/2018/wordml/cex" xmlns:w16cid="http://schemas.microsoft.com/office/word/2016/wordml/cid" xmlns:w16="http://schemas.microsoft.com/office/word/2018/wordml" xmlns:w16du="http://schemas.microsoft.com/office/word/2023/wordml/word16du" xmlns:w16sdtdh="http://schemas.microsoft.com/office/word/2020/wordml/sdtdatahash" xmlns:w16se="http://schemas.microsoft.com/office/word/2015/wordml/symex" xmlns:wpg="http://schemas.microsoft.com/office/word/2010/wordprocessingGroup" xmlns:wpi="http://schemas.microsoft.com/office/word/2010/wordprocessingInk" xmlns:wne="http://schemas.microsoft.com/office/word/2006/wordml" xmlns:wps="http://schemas.microsoft.com/office/word/2010/wordprocessingShape" mc:Ignorable="w14 w15 w16se w16cid w16 w16cex w16sdtdh wp14">
+<w:endnotes xmlns:wpc="http://schemas.microsoft.com/office/word/2010/wordprocessingCanvas" xmlns:cx="http://schemas.microsoft.com/office/drawing/2014/chartex" xmlns:cx1="http://schemas.microsoft.com/office/drawing/2015/9/8/chartex" xmlns:cx2="http://schemas.microsoft.com/office/drawing/2015/10/21/chartex" xmlns:cx3="http://schemas.microsoft.com/office/drawing/2016/5/9/chartex" xmlns:cx4="http://schemas.microsoft.com/office/drawing/2016/5/10/chartex" xmlns:cx5="http://schemas.microsoft.com/office/drawing/2016/5/11/chartex" xmlns:cx6="http://schemas.microsoft.com/office/drawing/2016/5/12/chartex" xmlns:cx7="http://schemas.microsoft.com/office/drawing/2016/5/13/chartex" xmlns:cx8="http://schemas.microsoft.com/office/drawing/2016/5/14/chartex" xmlns:mc="http://schemas.openxmlformats.org/markup-compatibility/2006" xmlns:aink="http://schemas.microsoft.com/office/drawing/2016/ink" xmlns:am3d="http://schemas.microsoft.com/office/drawing/2017/model3d" xmlns:o="urn:schemas-microsoft-com:office:office" xmlns:oel="http://schemas.microsoft.com/office/2019/extlst" xmlns:r="http://schemas.openxmlformats.org/officeDocument/2006/relationships" xmlns:m="http://schemas.openxmlformats.org/officeDocument/2006/math" xmlns:v="urn:schemas-microsoft-com:vml" xmlns:wp14="http://schemas.microsoft.com/office/word/2010/wordprocessingDrawing" xmlns:wp="http://schemas.openxmlformats.org/drawingml/2006/wordprocessingDrawing" xmlns:w10="urn:schemas-microsoft-com:office:word" xmlns:w="http://schemas.openxmlformats.org/wordprocessingml/2006/main" xmlns:w14="http://schemas.microsoft.com/office/word/2010/wordml" xmlns:w15="http://schemas.microsoft.com/office/word/2012/wordml" xmlns:w16cex="http://schemas.microsoft.com/office/word/2018/wordml/cex" xmlns:w16cid="http://schemas.microsoft.com/office/word/2016/wordml/cid" xmlns:w16="http://schemas.microsoft.com/office/word/2018/wordml" xmlns:w16du="http://schemas.microsoft.com/office/word/2023/wordml/word16du" xmlns:w16sdtdh="http://schemas.microsoft.com/office/word/2020/wordml/sdtdatahash" xmlns:w16sdtfl="http://schemas.microsoft.com/office/word/2024/wordml/sdtformatlock" xmlns:w16se="http://schemas.microsoft.com/office/word/2015/wordml/symex" xmlns:wpg="http://schemas.microsoft.com/office/word/2010/wordprocessingGroup" xmlns:wpi="http://schemas.microsoft.com/office/word/2010/wordprocessingInk" xmlns:wne="http://schemas.microsoft.com/office/word/2006/wordml" xmlns:wps="http://schemas.microsoft.com/office/word/2010/wordprocessingShape" mc:Ignorable="w14 w15 w16se w16cid w16 w16cex w16sdtdh w16sdtfl w16du wp14">
   <w:endnote w:type="separator" w:id="-1">
     <w:p>
       <w:pPr>
@@ -1394,7 +1006,7 @@
 </file>
 
 <file path=word/footer1.xml><?xml version="1.0" encoding="utf-8"?>
-<w:ftr xmlns:wpc="http://schemas.microsoft.com/office/word/2010/wordprocessingCanvas" xmlns:cx="http://schemas.microsoft.com/office/drawing/2014/chartex" xmlns:cx1="http://schemas.microsoft.com/office/drawing/2015/9/8/chartex" xmlns:cx2="http://schemas.microsoft.com/office/drawing/2015/10/21/chartex" xmlns:cx3="http://schemas.microsoft.com/office/drawing/2016/5/9/chartex" xmlns:cx4="http://schemas.microsoft.com/office/drawing/2016/5/10/chartex" xmlns:cx5="http://schemas.microsoft.com/office/drawing/2016/5/11/chartex" xmlns:cx6="http://schemas.microsoft.com/office/drawing/2016/5/12/chartex" xmlns:cx7="http://schemas.microsoft.com/office/drawing/2016/5/13/chartex" xmlns:cx8="http://schemas.microsoft.com/office/drawing/2016/5/14/chartex" xmlns:mc="http://schemas.openxmlformats.org/markup-compatibility/2006" xmlns:aink="http://schemas.microsoft.com/office/drawing/2016/ink" xmlns:am3d="http://schemas.microsoft.com/office/drawing/2017/model3d" xmlns:o="urn:schemas-microsoft-com:office:office" xmlns:oel="http://schemas.microsoft.com/office/2019/extlst" xmlns:r="http://schemas.openxmlformats.org/officeDocument/2006/relationships" xmlns:m="http://schemas.openxmlformats.org/officeDocument/2006/math" xmlns:v="urn:schemas-microsoft-com:vml" xmlns:wp14="http://schemas.microsoft.com/office/word/2010/wordprocessingDrawing" xmlns:wp="http://schemas.openxmlformats.org/drawingml/2006/wordprocessingDrawing" xmlns:w10="urn:schemas-microsoft-com:office:word" xmlns:w="http://schemas.openxmlformats.org/wordprocessingml/2006/main" xmlns:w14="http://schemas.microsoft.com/office/word/2010/wordml" xmlns:w15="http://schemas.microsoft.com/office/word/2012/wordml" xmlns:w16cex="http://schemas.microsoft.com/office/word/2018/wordml/cex" xmlns:w16cid="http://schemas.microsoft.com/office/word/2016/wordml/cid" xmlns:w16="http://schemas.microsoft.com/office/word/2018/wordml" xmlns:w16du="http://schemas.microsoft.com/office/word/2023/wordml/word16du" xmlns:w16sdtdh="http://schemas.microsoft.com/office/word/2020/wordml/sdtdatahash" xmlns:w16se="http://schemas.microsoft.com/office/word/2015/wordml/symex" xmlns:wpg="http://schemas.microsoft.com/office/word/2010/wordprocessingGroup" xmlns:wpi="http://schemas.microsoft.com/office/word/2010/wordprocessingInk" xmlns:wne="http://schemas.microsoft.com/office/word/2006/wordml" xmlns:wps="http://schemas.microsoft.com/office/word/2010/wordprocessingShape" mc:Ignorable="w14 w15 w16se w16cid w16 w16cex w16sdtdh wp14">
+<w:ftr xmlns:wpc="http://schemas.microsoft.com/office/word/2010/wordprocessingCanvas" xmlns:cx="http://schemas.microsoft.com/office/drawing/2014/chartex" xmlns:cx1="http://schemas.microsoft.com/office/drawing/2015/9/8/chartex" xmlns:cx2="http://schemas.microsoft.com/office/drawing/2015/10/21/chartex" xmlns:cx3="http://schemas.microsoft.com/office/drawing/2016/5/9/chartex" xmlns:cx4="http://schemas.microsoft.com/office/drawing/2016/5/10/chartex" xmlns:cx5="http://schemas.microsoft.com/office/drawing/2016/5/11/chartex" xmlns:cx6="http://schemas.microsoft.com/office/drawing/2016/5/12/chartex" xmlns:cx7="http://schemas.microsoft.com/office/drawing/2016/5/13/chartex" xmlns:cx8="http://schemas.microsoft.com/office/drawing/2016/5/14/chartex" xmlns:mc="http://schemas.openxmlformats.org/markup-compatibility/2006" xmlns:aink="http://schemas.microsoft.com/office/drawing/2016/ink" xmlns:am3d="http://schemas.microsoft.com/office/drawing/2017/model3d" xmlns:o="urn:schemas-microsoft-com:office:office" xmlns:oel="http://schemas.microsoft.com/office/2019/extlst" xmlns:r="http://schemas.openxmlformats.org/officeDocument/2006/relationships" xmlns:m="http://schemas.openxmlformats.org/officeDocument/2006/math" xmlns:v="urn:schemas-microsoft-com:vml" xmlns:wp14="http://schemas.microsoft.com/office/word/2010/wordprocessingDrawing" xmlns:wp="http://schemas.openxmlformats.org/drawingml/2006/wordprocessingDrawing" xmlns:w10="urn:schemas-microsoft-com:office:word" xmlns:w="http://schemas.openxmlformats.org/wordprocessingml/2006/main" xmlns:w14="http://schemas.microsoft.com/office/word/2010/wordml" xmlns:w15="http://schemas.microsoft.com/office/word/2012/wordml" xmlns:w16cex="http://schemas.microsoft.com/office/word/2018/wordml/cex" xmlns:w16cid="http://schemas.microsoft.com/office/word/2016/wordml/cid" xmlns:w16="http://schemas.microsoft.com/office/word/2018/wordml" xmlns:w16du="http://schemas.microsoft.com/office/word/2023/wordml/word16du" xmlns:w16sdtdh="http://schemas.microsoft.com/office/word/2020/wordml/sdtdatahash" xmlns:w16sdtfl="http://schemas.microsoft.com/office/word/2024/wordml/sdtformatlock" xmlns:w16se="http://schemas.microsoft.com/office/word/2015/wordml/symex" xmlns:wpg="http://schemas.microsoft.com/office/word/2010/wordprocessingGroup" xmlns:wpi="http://schemas.microsoft.com/office/word/2010/wordprocessingInk" xmlns:wne="http://schemas.microsoft.com/office/word/2006/wordml" xmlns:wps="http://schemas.microsoft.com/office/word/2010/wordprocessingShape" mc:Ignorable="w14 w15 w16se w16cid w16 w16cex w16sdtdh w16sdtfl w16du wp14">
   <w:p>
     <w:pPr>
       <w:pStyle w:val="Footer"/>
@@ -1404,7 +1016,7 @@
 </file>
 
 <file path=word/footer2.xml><?xml version="1.0" encoding="utf-8"?>
-<w:ftr xmlns:wpc="http://schemas.microsoft.com/office/word/2010/wordprocessingCanvas" xmlns:cx="http://schemas.microsoft.com/office/drawing/2014/chartex" xmlns:cx1="http://schemas.microsoft.com/office/drawing/2015/9/8/chartex" xmlns:cx2="http://schemas.microsoft.com/office/drawing/2015/10/21/chartex" xmlns:cx3="http://schemas.microsoft.com/office/drawing/2016/5/9/chartex" xmlns:cx4="http://schemas.microsoft.com/office/drawing/2016/5/10/chartex" xmlns:cx5="http://schemas.microsoft.com/office/drawing/2016/5/11/chartex" xmlns:cx6="http://schemas.microsoft.com/office/drawing/2016/5/12/chartex" xmlns:cx7="http://schemas.microsoft.com/office/drawing/2016/5/13/chartex" xmlns:cx8="http://schemas.microsoft.com/office/drawing/2016/5/14/chartex" xmlns:mc="http://schemas.openxmlformats.org/markup-compatibility/2006" xmlns:aink="http://schemas.microsoft.com/office/drawing/2016/ink" xmlns:am3d="http://schemas.microsoft.com/office/drawing/2017/model3d" xmlns:o="urn:schemas-microsoft-com:office:office" xmlns:oel="http://schemas.microsoft.com/office/2019/extlst" xmlns:r="http://schemas.openxmlformats.org/officeDocument/2006/relationships" xmlns:m="http://schemas.openxmlformats.org/officeDocument/2006/math" xmlns:v="urn:schemas-microsoft-com:vml" xmlns:wp14="http://schemas.microsoft.com/office/word/2010/wordprocessingDrawing" xmlns:wp="http://schemas.openxmlformats.org/drawingml/2006/wordprocessingDrawing" xmlns:w10="urn:schemas-microsoft-com:office:word" xmlns:w="http://schemas.openxmlformats.org/wordprocessingml/2006/main" xmlns:w14="http://schemas.microsoft.com/office/word/2010/wordml" xmlns:w15="http://schemas.microsoft.com/office/word/2012/wordml" xmlns:w16cex="http://schemas.microsoft.com/office/word/2018/wordml/cex" xmlns:w16cid="http://schemas.microsoft.com/office/word/2016/wordml/cid" xmlns:w16="http://schemas.microsoft.com/office/word/2018/wordml" xmlns:w16du="http://schemas.microsoft.com/office/word/2023/wordml/word16du" xmlns:w16sdtdh="http://schemas.microsoft.com/office/word/2020/wordml/sdtdatahash" xmlns:w16se="http://schemas.microsoft.com/office/word/2015/wordml/symex" xmlns:wpg="http://schemas.microsoft.com/office/word/2010/wordprocessingGroup" xmlns:wpi="http://schemas.microsoft.com/office/word/2010/wordprocessingInk" xmlns:wne="http://schemas.microsoft.com/office/word/2006/wordml" xmlns:wps="http://schemas.microsoft.com/office/word/2010/wordprocessingShape" mc:Ignorable="w14 w15 w16se w16cid w16 w16cex w16sdtdh wp14">
+<w:ftr xmlns:wpc="http://schemas.microsoft.com/office/word/2010/wordprocessingCanvas" xmlns:cx="http://schemas.microsoft.com/office/drawing/2014/chartex" xmlns:cx1="http://schemas.microsoft.com/office/drawing/2015/9/8/chartex" xmlns:cx2="http://schemas.microsoft.com/office/drawing/2015/10/21/chartex" xmlns:cx3="http://schemas.microsoft.com/office/drawing/2016/5/9/chartex" xmlns:cx4="http://schemas.microsoft.com/office/drawing/2016/5/10/chartex" xmlns:cx5="http://schemas.microsoft.com/office/drawing/2016/5/11/chartex" xmlns:cx6="http://schemas.microsoft.com/office/drawing/2016/5/12/chartex" xmlns:cx7="http://schemas.microsoft.com/office/drawing/2016/5/13/chartex" xmlns:cx8="http://schemas.microsoft.com/office/drawing/2016/5/14/chartex" xmlns:mc="http://schemas.openxmlformats.org/markup-compatibility/2006" xmlns:aink="http://schemas.microsoft.com/office/drawing/2016/ink" xmlns:am3d="http://schemas.microsoft.com/office/drawing/2017/model3d" xmlns:o="urn:schemas-microsoft-com:office:office" xmlns:oel="http://schemas.microsoft.com/office/2019/extlst" xmlns:r="http://schemas.openxmlformats.org/officeDocument/2006/relationships" xmlns:m="http://schemas.openxmlformats.org/officeDocument/2006/math" xmlns:v="urn:schemas-microsoft-com:vml" xmlns:wp14="http://schemas.microsoft.com/office/word/2010/wordprocessingDrawing" xmlns:wp="http://schemas.openxmlformats.org/drawingml/2006/wordprocessingDrawing" xmlns:w10="urn:schemas-microsoft-com:office:word" xmlns:w="http://schemas.openxmlformats.org/wordprocessingml/2006/main" xmlns:w14="http://schemas.microsoft.com/office/word/2010/wordml" xmlns:w15="http://schemas.microsoft.com/office/word/2012/wordml" xmlns:w16cex="http://schemas.microsoft.com/office/word/2018/wordml/cex" xmlns:w16cid="http://schemas.microsoft.com/office/word/2016/wordml/cid" xmlns:w16="http://schemas.microsoft.com/office/word/2018/wordml" xmlns:w16du="http://schemas.microsoft.com/office/word/2023/wordml/word16du" xmlns:w16sdtdh="http://schemas.microsoft.com/office/word/2020/wordml/sdtdatahash" xmlns:w16sdtfl="http://schemas.microsoft.com/office/word/2024/wordml/sdtformatlock" xmlns:w16se="http://schemas.microsoft.com/office/word/2015/wordml/symex" xmlns:wpg="http://schemas.microsoft.com/office/word/2010/wordprocessingGroup" xmlns:wpi="http://schemas.microsoft.com/office/word/2010/wordprocessingInk" xmlns:wne="http://schemas.microsoft.com/office/word/2006/wordml" xmlns:wps="http://schemas.microsoft.com/office/word/2010/wordprocessingShape" mc:Ignorable="w14 w15 w16se w16cid w16 w16cex w16sdtdh w16sdtfl w16du wp14">
   <w:p>
     <w:pPr>
       <w:jc w:val="right"/>
@@ -1457,7 +1069,7 @@
 </file>
 
 <file path=word/footer3.xml><?xml version="1.0" encoding="utf-8"?>
-<w:ftr xmlns:wpc="http://schemas.microsoft.com/office/word/2010/wordprocessingCanvas" xmlns:cx="http://schemas.microsoft.com/office/drawing/2014/chartex" xmlns:cx1="http://schemas.microsoft.com/office/drawing/2015/9/8/chartex" xmlns:cx2="http://schemas.microsoft.com/office/drawing/2015/10/21/chartex" xmlns:cx3="http://schemas.microsoft.com/office/drawing/2016/5/9/chartex" xmlns:cx4="http://schemas.microsoft.com/office/drawing/2016/5/10/chartex" xmlns:cx5="http://schemas.microsoft.com/office/drawing/2016/5/11/chartex" xmlns:cx6="http://schemas.microsoft.com/office/drawing/2016/5/12/chartex" xmlns:cx7="http://schemas.microsoft.com/office/drawing/2016/5/13/chartex" xmlns:cx8="http://schemas.microsoft.com/office/drawing/2016/5/14/chartex" xmlns:mc="http://schemas.openxmlformats.org/markup-compatibility/2006" xmlns:aink="http://schemas.microsoft.com/office/drawing/2016/ink" xmlns:am3d="http://schemas.microsoft.com/office/drawing/2017/model3d" xmlns:o="urn:schemas-microsoft-com:office:office" xmlns:oel="http://schemas.microsoft.com/office/2019/extlst" xmlns:r="http://schemas.openxmlformats.org/officeDocument/2006/relationships" xmlns:m="http://schemas.openxmlformats.org/officeDocument/2006/math" xmlns:v="urn:schemas-microsoft-com:vml" xmlns:wp14="http://schemas.microsoft.com/office/word/2010/wordprocessingDrawing" xmlns:wp="http://schemas.openxmlformats.org/drawingml/2006/wordprocessingDrawing" xmlns:w10="urn:schemas-microsoft-com:office:word" xmlns:w="http://schemas.openxmlformats.org/wordprocessingml/2006/main" xmlns:w14="http://schemas.microsoft.com/office/word/2010/wordml" xmlns:w15="http://schemas.microsoft.com/office/word/2012/wordml" xmlns:w16cex="http://schemas.microsoft.com/office/word/2018/wordml/cex" xmlns:w16cid="http://schemas.microsoft.com/office/word/2016/wordml/cid" xmlns:w16="http://schemas.microsoft.com/office/word/2018/wordml" xmlns:w16du="http://schemas.microsoft.com/office/word/2023/wordml/word16du" xmlns:w16sdtdh="http://schemas.microsoft.com/office/word/2020/wordml/sdtdatahash" xmlns:w16se="http://schemas.microsoft.com/office/word/2015/wordml/symex" xmlns:wpg="http://schemas.microsoft.com/office/word/2010/wordprocessingGroup" xmlns:wpi="http://schemas.microsoft.com/office/word/2010/wordprocessingInk" xmlns:wne="http://schemas.microsoft.com/office/word/2006/wordml" xmlns:wps="http://schemas.microsoft.com/office/word/2010/wordprocessingShape" mc:Ignorable="w14 w15 w16se w16cid w16 w16cex w16sdtdh wp14">
+<w:ftr xmlns:wpc="http://schemas.microsoft.com/office/word/2010/wordprocessingCanvas" xmlns:cx="http://schemas.microsoft.com/office/drawing/2014/chartex" xmlns:cx1="http://schemas.microsoft.com/office/drawing/2015/9/8/chartex" xmlns:cx2="http://schemas.microsoft.com/office/drawing/2015/10/21/chartex" xmlns:cx3="http://schemas.microsoft.com/office/drawing/2016/5/9/chartex" xmlns:cx4="http://schemas.microsoft.com/office/drawing/2016/5/10/chartex" xmlns:cx5="http://schemas.microsoft.com/office/drawing/2016/5/11/chartex" xmlns:cx6="http://schemas.microsoft.com/office/drawing/2016/5/12/chartex" xmlns:cx7="http://schemas.microsoft.com/office/drawing/2016/5/13/chartex" xmlns:cx8="http://schemas.microsoft.com/office/drawing/2016/5/14/chartex" xmlns:mc="http://schemas.openxmlformats.org/markup-compatibility/2006" xmlns:aink="http://schemas.microsoft.com/office/drawing/2016/ink" xmlns:am3d="http://schemas.microsoft.com/office/drawing/2017/model3d" xmlns:o="urn:schemas-microsoft-com:office:office" xmlns:oel="http://schemas.microsoft.com/office/2019/extlst" xmlns:r="http://schemas.openxmlformats.org/officeDocument/2006/relationships" xmlns:m="http://schemas.openxmlformats.org/officeDocument/2006/math" xmlns:v="urn:schemas-microsoft-com:vml" xmlns:wp14="http://schemas.microsoft.com/office/word/2010/wordprocessingDrawing" xmlns:wp="http://schemas.openxmlformats.org/drawingml/2006/wordprocessingDrawing" xmlns:w10="urn:schemas-microsoft-com:office:word" xmlns:w="http://schemas.openxmlformats.org/wordprocessingml/2006/main" xmlns:w14="http://schemas.microsoft.com/office/word/2010/wordml" xmlns:w15="http://schemas.microsoft.com/office/word/2012/wordml" xmlns:w16cex="http://schemas.microsoft.com/office/word/2018/wordml/cex" xmlns:w16cid="http://schemas.microsoft.com/office/word/2016/wordml/cid" xmlns:w16="http://schemas.microsoft.com/office/word/2018/wordml" xmlns:w16du="http://schemas.microsoft.com/office/word/2023/wordml/word16du" xmlns:w16sdtdh="http://schemas.microsoft.com/office/word/2020/wordml/sdtdatahash" xmlns:w16sdtfl="http://schemas.microsoft.com/office/word/2024/wordml/sdtformatlock" xmlns:w16se="http://schemas.microsoft.com/office/word/2015/wordml/symex" xmlns:wpg="http://schemas.microsoft.com/office/word/2010/wordprocessingGroup" xmlns:wpi="http://schemas.microsoft.com/office/word/2010/wordprocessingInk" xmlns:wne="http://schemas.microsoft.com/office/word/2006/wordml" xmlns:wps="http://schemas.microsoft.com/office/word/2010/wordprocessingShape" mc:Ignorable="w14 w15 w16se w16cid w16 w16cex w16sdtdh w16sdtfl w16du wp14">
   <w:p>
     <w:pPr>
       <w:pStyle w:val="Header"/>
@@ -1522,7 +1134,6 @@
           <w:docPartUnique/>
         </w:docPartObj>
       </w:sdtPr>
-      <w:sdtEndPr/>
       <w:sdtContent>
         <w:r>
           <w:t xml:space="preserve">Page </w:t>
@@ -1628,7 +1239,7 @@
 </file>
 
 <file path=word/footnotes.xml><?xml version="1.0" encoding="utf-8"?>
-<w:footnotes xmlns:wpc="http://schemas.microsoft.com/office/word/2010/wordprocessingCanvas" xmlns:cx="http://schemas.microsoft.com/office/drawing/2014/chartex" xmlns:cx1="http://schemas.microsoft.com/office/drawing/2015/9/8/chartex" xmlns:cx2="http://schemas.microsoft.com/office/drawing/2015/10/21/chartex" xmlns:cx3="http://schemas.microsoft.com/office/drawing/2016/5/9/chartex" xmlns:cx4="http://schemas.microsoft.com/office/drawing/2016/5/10/chartex" xmlns:cx5="http://schemas.microsoft.com/office/drawing/2016/5/11/chartex" xmlns:cx6="http://schemas.microsoft.com/office/drawing/2016/5/12/chartex" xmlns:cx7="http://schemas.microsoft.com/office/drawing/2016/5/13/chartex" xmlns:cx8="http://schemas.microsoft.com/office/drawing/2016/5/14/chartex" xmlns:mc="http://schemas.openxmlformats.org/markup-compatibility/2006" xmlns:aink="http://schemas.microsoft.com/office/drawing/2016/ink" xmlns:am3d="http://schemas.microsoft.com/office/drawing/2017/model3d" xmlns:o="urn:schemas-microsoft-com:office:office" xmlns:oel="http://schemas.microsoft.com/office/2019/extlst" xmlns:r="http://schemas.openxmlformats.org/officeDocument/2006/relationships" xmlns:m="http://schemas.openxmlformats.org/officeDocument/2006/math" xmlns:v="urn:schemas-microsoft-com:vml" xmlns:wp14="http://schemas.microsoft.com/office/word/2010/wordprocessingDrawing" xmlns:wp="http://schemas.openxmlformats.org/drawingml/2006/wordprocessingDrawing" xmlns:w10="urn:schemas-microsoft-com:office:word" xmlns:w="http://schemas.openxmlformats.org/wordprocessingml/2006/main" xmlns:w14="http://schemas.microsoft.com/office/word/2010/wordml" xmlns:w15="http://schemas.microsoft.com/office/word/2012/wordml" xmlns:w16cex="http://schemas.microsoft.com/office/word/2018/wordml/cex" xmlns:w16cid="http://schemas.microsoft.com/office/word/2016/wordml/cid" xmlns:w16="http://schemas.microsoft.com/office/word/2018/wordml" xmlns:w16du="http://schemas.microsoft.com/office/word/2023/wordml/word16du" xmlns:w16sdtdh="http://schemas.microsoft.com/office/word/2020/wordml/sdtdatahash" xmlns:w16se="http://schemas.microsoft.com/office/word/2015/wordml/symex" xmlns:wpg="http://schemas.microsoft.com/office/word/2010/wordprocessingGroup" xmlns:wpi="http://schemas.microsoft.com/office/word/2010/wordprocessingInk" xmlns:wne="http://schemas.microsoft.com/office/word/2006/wordml" xmlns:wps="http://schemas.microsoft.com/office/word/2010/wordprocessingShape" mc:Ignorable="w14 w15 w16se w16cid w16 w16cex w16sdtdh wp14">
+<w:footnotes xmlns:wpc="http://schemas.microsoft.com/office/word/2010/wordprocessingCanvas" xmlns:cx="http://schemas.microsoft.com/office/drawing/2014/chartex" xmlns:cx1="http://schemas.microsoft.com/office/drawing/2015/9/8/chartex" xmlns:cx2="http://schemas.microsoft.com/office/drawing/2015/10/21/chartex" xmlns:cx3="http://schemas.microsoft.com/office/drawing/2016/5/9/chartex" xmlns:cx4="http://schemas.microsoft.com/office/drawing/2016/5/10/chartex" xmlns:cx5="http://schemas.microsoft.com/office/drawing/2016/5/11/chartex" xmlns:cx6="http://schemas.microsoft.com/office/drawing/2016/5/12/chartex" xmlns:cx7="http://schemas.microsoft.com/office/drawing/2016/5/13/chartex" xmlns:cx8="http://schemas.microsoft.com/office/drawing/2016/5/14/chartex" xmlns:mc="http://schemas.openxmlformats.org/markup-compatibility/2006" xmlns:aink="http://schemas.microsoft.com/office/drawing/2016/ink" xmlns:am3d="http://schemas.microsoft.com/office/drawing/2017/model3d" xmlns:o="urn:schemas-microsoft-com:office:office" xmlns:oel="http://schemas.microsoft.com/office/2019/extlst" xmlns:r="http://schemas.openxmlformats.org/officeDocument/2006/relationships" xmlns:m="http://schemas.openxmlformats.org/officeDocument/2006/math" xmlns:v="urn:schemas-microsoft-com:vml" xmlns:wp14="http://schemas.microsoft.com/office/word/2010/wordprocessingDrawing" xmlns:wp="http://schemas.openxmlformats.org/drawingml/2006/wordprocessingDrawing" xmlns:w10="urn:schemas-microsoft-com:office:word" xmlns:w="http://schemas.openxmlformats.org/wordprocessingml/2006/main" xmlns:w14="http://schemas.microsoft.com/office/word/2010/wordml" xmlns:w15="http://schemas.microsoft.com/office/word/2012/wordml" xmlns:w16cex="http://schemas.microsoft.com/office/word/2018/wordml/cex" xmlns:w16cid="http://schemas.microsoft.com/office/word/2016/wordml/cid" xmlns:w16="http://schemas.microsoft.com/office/word/2018/wordml" xmlns:w16du="http://schemas.microsoft.com/office/word/2023/wordml/word16du" xmlns:w16sdtdh="http://schemas.microsoft.com/office/word/2020/wordml/sdtdatahash" xmlns:w16sdtfl="http://schemas.microsoft.com/office/word/2024/wordml/sdtformatlock" xmlns:w16se="http://schemas.microsoft.com/office/word/2015/wordml/symex" xmlns:wpg="http://schemas.microsoft.com/office/word/2010/wordprocessingGroup" xmlns:wpi="http://schemas.microsoft.com/office/word/2010/wordprocessingInk" xmlns:wne="http://schemas.microsoft.com/office/word/2006/wordml" xmlns:wps="http://schemas.microsoft.com/office/word/2010/wordprocessingShape" mc:Ignorable="w14 w15 w16se w16cid w16 w16cex w16sdtdh w16sdtfl w16du wp14">
   <w:footnote w:type="separator" w:id="-1">
     <w:p>
       <w:pPr>
@@ -1653,7 +1264,7 @@
 </file>
 
 <file path=word/header1.xml><?xml version="1.0" encoding="utf-8"?>
-<w:hdr xmlns:wpc="http://schemas.microsoft.com/office/word/2010/wordprocessingCanvas" xmlns:cx="http://schemas.microsoft.com/office/drawing/2014/chartex" xmlns:cx1="http://schemas.microsoft.com/office/drawing/2015/9/8/chartex" xmlns:cx2="http://schemas.microsoft.com/office/drawing/2015/10/21/chartex" xmlns:cx3="http://schemas.microsoft.com/office/drawing/2016/5/9/chartex" xmlns:cx4="http://schemas.microsoft.com/office/drawing/2016/5/10/chartex" xmlns:cx5="http://schemas.microsoft.com/office/drawing/2016/5/11/chartex" xmlns:cx6="http://schemas.microsoft.com/office/drawing/2016/5/12/chartex" xmlns:cx7="http://schemas.microsoft.com/office/drawing/2016/5/13/chartex" xmlns:cx8="http://schemas.microsoft.com/office/drawing/2016/5/14/chartex" xmlns:mc="http://schemas.openxmlformats.org/markup-compatibility/2006" xmlns:aink="http://schemas.microsoft.com/office/drawing/2016/ink" xmlns:am3d="http://schemas.microsoft.com/office/drawing/2017/model3d" xmlns:o="urn:schemas-microsoft-com:office:office" xmlns:oel="http://schemas.microsoft.com/office/2019/extlst" xmlns:r="http://schemas.openxmlformats.org/officeDocument/2006/relationships" xmlns:m="http://schemas.openxmlformats.org/officeDocument/2006/math" xmlns:v="urn:schemas-microsoft-com:vml" xmlns:wp14="http://schemas.microsoft.com/office/word/2010/wordprocessingDrawing" xmlns:wp="http://schemas.openxmlformats.org/drawingml/2006/wordprocessingDrawing" xmlns:w10="urn:schemas-microsoft-com:office:word" xmlns:w="http://schemas.openxmlformats.org/wordprocessingml/2006/main" xmlns:w14="http://schemas.microsoft.com/office/word/2010/wordml" xmlns:w15="http://schemas.microsoft.com/office/word/2012/wordml" xmlns:w16cex="http://schemas.microsoft.com/office/word/2018/wordml/cex" xmlns:w16cid="http://schemas.microsoft.com/office/word/2016/wordml/cid" xmlns:w16="http://schemas.microsoft.com/office/word/2018/wordml" xmlns:w16du="http://schemas.microsoft.com/office/word/2023/wordml/word16du" xmlns:w16sdtdh="http://schemas.microsoft.com/office/word/2020/wordml/sdtdatahash" xmlns:w16se="http://schemas.microsoft.com/office/word/2015/wordml/symex" xmlns:wpg="http://schemas.microsoft.com/office/word/2010/wordprocessingGroup" xmlns:wpi="http://schemas.microsoft.com/office/word/2010/wordprocessingInk" xmlns:wne="http://schemas.microsoft.com/office/word/2006/wordml" xmlns:wps="http://schemas.microsoft.com/office/word/2010/wordprocessingShape" mc:Ignorable="w14 w15 w16se w16cid w16 w16cex w16sdtdh wp14">
+<w:hdr xmlns:wpc="http://schemas.microsoft.com/office/word/2010/wordprocessingCanvas" xmlns:cx="http://schemas.microsoft.com/office/drawing/2014/chartex" xmlns:cx1="http://schemas.microsoft.com/office/drawing/2015/9/8/chartex" xmlns:cx2="http://schemas.microsoft.com/office/drawing/2015/10/21/chartex" xmlns:cx3="http://schemas.microsoft.com/office/drawing/2016/5/9/chartex" xmlns:cx4="http://schemas.microsoft.com/office/drawing/2016/5/10/chartex" xmlns:cx5="http://schemas.microsoft.com/office/drawing/2016/5/11/chartex" xmlns:cx6="http://schemas.microsoft.com/office/drawing/2016/5/12/chartex" xmlns:cx7="http://schemas.microsoft.com/office/drawing/2016/5/13/chartex" xmlns:cx8="http://schemas.microsoft.com/office/drawing/2016/5/14/chartex" xmlns:mc="http://schemas.openxmlformats.org/markup-compatibility/2006" xmlns:aink="http://schemas.microsoft.com/office/drawing/2016/ink" xmlns:am3d="http://schemas.microsoft.com/office/drawing/2017/model3d" xmlns:o="urn:schemas-microsoft-com:office:office" xmlns:oel="http://schemas.microsoft.com/office/2019/extlst" xmlns:r="http://schemas.openxmlformats.org/officeDocument/2006/relationships" xmlns:m="http://schemas.openxmlformats.org/officeDocument/2006/math" xmlns:v="urn:schemas-microsoft-com:vml" xmlns:wp14="http://schemas.microsoft.com/office/word/2010/wordprocessingDrawing" xmlns:wp="http://schemas.openxmlformats.org/drawingml/2006/wordprocessingDrawing" xmlns:w10="urn:schemas-microsoft-com:office:word" xmlns:w="http://schemas.openxmlformats.org/wordprocessingml/2006/main" xmlns:w14="http://schemas.microsoft.com/office/word/2010/wordml" xmlns:w15="http://schemas.microsoft.com/office/word/2012/wordml" xmlns:w16cex="http://schemas.microsoft.com/office/word/2018/wordml/cex" xmlns:w16cid="http://schemas.microsoft.com/office/word/2016/wordml/cid" xmlns:w16="http://schemas.microsoft.com/office/word/2018/wordml" xmlns:w16du="http://schemas.microsoft.com/office/word/2023/wordml/word16du" xmlns:w16sdtdh="http://schemas.microsoft.com/office/word/2020/wordml/sdtdatahash" xmlns:w16sdtfl="http://schemas.microsoft.com/office/word/2024/wordml/sdtformatlock" xmlns:w16se="http://schemas.microsoft.com/office/word/2015/wordml/symex" xmlns:wpg="http://schemas.microsoft.com/office/word/2010/wordprocessingGroup" xmlns:wpi="http://schemas.microsoft.com/office/word/2010/wordprocessingInk" xmlns:wne="http://schemas.microsoft.com/office/word/2006/wordml" xmlns:wps="http://schemas.microsoft.com/office/word/2010/wordprocessingShape" mc:Ignorable="w14 w15 w16se w16cid w16 w16cex w16sdtdh w16sdtfl w16du wp14">
   <w:p>
     <w:pPr>
       <w:pStyle w:val="Header"/>
@@ -1663,7 +1274,7 @@
 </file>
 
 <file path=word/header2.xml><?xml version="1.0" encoding="utf-8"?>
-<w:hdr xmlns:wpc="http://schemas.microsoft.com/office/word/2010/wordprocessingCanvas" xmlns:cx="http://schemas.microsoft.com/office/drawing/2014/chartex" xmlns:cx1="http://schemas.microsoft.com/office/drawing/2015/9/8/chartex" xmlns:cx2="http://schemas.microsoft.com/office/drawing/2015/10/21/chartex" xmlns:cx3="http://schemas.microsoft.com/office/drawing/2016/5/9/chartex" xmlns:cx4="http://schemas.microsoft.com/office/drawing/2016/5/10/chartex" xmlns:cx5="http://schemas.microsoft.com/office/drawing/2016/5/11/chartex" xmlns:cx6="http://schemas.microsoft.com/office/drawing/2016/5/12/chartex" xmlns:cx7="http://schemas.microsoft.com/office/drawing/2016/5/13/chartex" xmlns:cx8="http://schemas.microsoft.com/office/drawing/2016/5/14/chartex" xmlns:mc="http://schemas.openxmlformats.org/markup-compatibility/2006" xmlns:aink="http://schemas.microsoft.com/office/drawing/2016/ink" xmlns:am3d="http://schemas.microsoft.com/office/drawing/2017/model3d" xmlns:o="urn:schemas-microsoft-com:office:office" xmlns:oel="http://schemas.microsoft.com/office/2019/extlst" xmlns:r="http://schemas.openxmlformats.org/officeDocument/2006/relationships" xmlns:m="http://schemas.openxmlformats.org/officeDocument/2006/math" xmlns:v="urn:schemas-microsoft-com:vml" xmlns:wp14="http://schemas.microsoft.com/office/word/2010/wordprocessingDrawing" xmlns:wp="http://schemas.openxmlformats.org/drawingml/2006/wordprocessingDrawing" xmlns:w10="urn:schemas-microsoft-com:office:word" xmlns:w="http://schemas.openxmlformats.org/wordprocessingml/2006/main" xmlns:w14="http://schemas.microsoft.com/office/word/2010/wordml" xmlns:w15="http://schemas.microsoft.com/office/word/2012/wordml" xmlns:w16cex="http://schemas.microsoft.com/office/word/2018/wordml/cex" xmlns:w16cid="http://schemas.microsoft.com/office/word/2016/wordml/cid" xmlns:w16="http://schemas.microsoft.com/office/word/2018/wordml" xmlns:w16du="http://schemas.microsoft.com/office/word/2023/wordml/word16du" xmlns:w16sdtdh="http://schemas.microsoft.com/office/word/2020/wordml/sdtdatahash" xmlns:w16se="http://schemas.microsoft.com/office/word/2015/wordml/symex" xmlns:wpg="http://schemas.microsoft.com/office/word/2010/wordprocessingGroup" xmlns:wpi="http://schemas.microsoft.com/office/word/2010/wordprocessingInk" xmlns:wne="http://schemas.microsoft.com/office/word/2006/wordml" xmlns:wps="http://schemas.microsoft.com/office/word/2010/wordprocessingShape" mc:Ignorable="w14 w15 w16se w16cid w16 w16cex w16sdtdh wp14">
+<w:hdr xmlns:wpc="http://schemas.microsoft.com/office/word/2010/wordprocessingCanvas" xmlns:cx="http://schemas.microsoft.com/office/drawing/2014/chartex" xmlns:cx1="http://schemas.microsoft.com/office/drawing/2015/9/8/chartex" xmlns:cx2="http://schemas.microsoft.com/office/drawing/2015/10/21/chartex" xmlns:cx3="http://schemas.microsoft.com/office/drawing/2016/5/9/chartex" xmlns:cx4="http://schemas.microsoft.com/office/drawing/2016/5/10/chartex" xmlns:cx5="http://schemas.microsoft.com/office/drawing/2016/5/11/chartex" xmlns:cx6="http://schemas.microsoft.com/office/drawing/2016/5/12/chartex" xmlns:cx7="http://schemas.microsoft.com/office/drawing/2016/5/13/chartex" xmlns:cx8="http://schemas.microsoft.com/office/drawing/2016/5/14/chartex" xmlns:mc="http://schemas.openxmlformats.org/markup-compatibility/2006" xmlns:aink="http://schemas.microsoft.com/office/drawing/2016/ink" xmlns:am3d="http://schemas.microsoft.com/office/drawing/2017/model3d" xmlns:o="urn:schemas-microsoft-com:office:office" xmlns:oel="http://schemas.microsoft.com/office/2019/extlst" xmlns:r="http://schemas.openxmlformats.org/officeDocument/2006/relationships" xmlns:m="http://schemas.openxmlformats.org/officeDocument/2006/math" xmlns:v="urn:schemas-microsoft-com:vml" xmlns:wp14="http://schemas.microsoft.com/office/word/2010/wordprocessingDrawing" xmlns:wp="http://schemas.openxmlformats.org/drawingml/2006/wordprocessingDrawing" xmlns:w10="urn:schemas-microsoft-com:office:word" xmlns:w="http://schemas.openxmlformats.org/wordprocessingml/2006/main" xmlns:w14="http://schemas.microsoft.com/office/word/2010/wordml" xmlns:w15="http://schemas.microsoft.com/office/word/2012/wordml" xmlns:w16cex="http://schemas.microsoft.com/office/word/2018/wordml/cex" xmlns:w16cid="http://schemas.microsoft.com/office/word/2016/wordml/cid" xmlns:w16="http://schemas.microsoft.com/office/word/2018/wordml" xmlns:w16du="http://schemas.microsoft.com/office/word/2023/wordml/word16du" xmlns:w16sdtdh="http://schemas.microsoft.com/office/word/2020/wordml/sdtdatahash" xmlns:w16sdtfl="http://schemas.microsoft.com/office/word/2024/wordml/sdtformatlock" xmlns:w16se="http://schemas.microsoft.com/office/word/2015/wordml/symex" xmlns:wpg="http://schemas.microsoft.com/office/word/2010/wordprocessingGroup" xmlns:wpi="http://schemas.microsoft.com/office/word/2010/wordprocessingInk" xmlns:wne="http://schemas.microsoft.com/office/word/2006/wordml" xmlns:wps="http://schemas.microsoft.com/office/word/2010/wordprocessingShape" mc:Ignorable="w14 w15 w16se w16cid w16 w16cex w16sdtdh w16sdtfl w16du wp14">
   <w:p>
     <w:pPr>
       <w:pStyle w:val="Header"/>
@@ -1690,15 +1301,7 @@
       <w:t xml:space="preserve">Exclusion of foreign beneficiaries </w:t>
     </w:r>
     <w:r>
-      <w:t>– [[</w:t>
-    </w:r>
-    <w:proofErr w:type="spellStart"/>
-    <w:r>
-      <w:t>trust_name</w:t>
-    </w:r>
-    <w:proofErr w:type="spellEnd"/>
-    <w:r>
-      <w:t>]]</w:t>
+      <w:t>– [[trust_name]]</w:t>
     </w:r>
     <w:r>
       <w:br/>
@@ -1716,7 +1319,7 @@
       <w:rPr>
         <w:noProof/>
       </w:rPr>
-      <w:t>11 May 2023</w:t>
+      <w:t>15 July 2026</w:t>
     </w:r>
     <w:r>
       <w:fldChar w:fldCharType="end"/>
@@ -1732,7 +1335,6 @@
           <w:docPartUnique/>
         </w:docPartObj>
       </w:sdtPr>
-      <w:sdtEndPr/>
       <w:sdtContent>
         <w:r>
           <w:t xml:space="preserve">Page </w:t>
@@ -1833,13 +1435,13 @@
 </file>
 
 <file path=word/header3.xml><?xml version="1.0" encoding="utf-8"?>
-<w:hdr xmlns:wpc="http://schemas.microsoft.com/office/word/2010/wordprocessingCanvas" xmlns:cx="http://schemas.microsoft.com/office/drawing/2014/chartex" xmlns:cx1="http://schemas.microsoft.com/office/drawing/2015/9/8/chartex" xmlns:cx2="http://schemas.microsoft.com/office/drawing/2015/10/21/chartex" xmlns:cx3="http://schemas.microsoft.com/office/drawing/2016/5/9/chartex" xmlns:cx4="http://schemas.microsoft.com/office/drawing/2016/5/10/chartex" xmlns:cx5="http://schemas.microsoft.com/office/drawing/2016/5/11/chartex" xmlns:cx6="http://schemas.microsoft.com/office/drawing/2016/5/12/chartex" xmlns:cx7="http://schemas.microsoft.com/office/drawing/2016/5/13/chartex" xmlns:cx8="http://schemas.microsoft.com/office/drawing/2016/5/14/chartex" xmlns:mc="http://schemas.openxmlformats.org/markup-compatibility/2006" xmlns:aink="http://schemas.microsoft.com/office/drawing/2016/ink" xmlns:am3d="http://schemas.microsoft.com/office/drawing/2017/model3d" xmlns:o="urn:schemas-microsoft-com:office:office" xmlns:oel="http://schemas.microsoft.com/office/2019/extlst" xmlns:r="http://schemas.openxmlformats.org/officeDocument/2006/relationships" xmlns:m="http://schemas.openxmlformats.org/officeDocument/2006/math" xmlns:v="urn:schemas-microsoft-com:vml" xmlns:wp14="http://schemas.microsoft.com/office/word/2010/wordprocessingDrawing" xmlns:wp="http://schemas.openxmlformats.org/drawingml/2006/wordprocessingDrawing" xmlns:w10="urn:schemas-microsoft-com:office:word" xmlns:w="http://schemas.openxmlformats.org/wordprocessingml/2006/main" xmlns:w14="http://schemas.microsoft.com/office/word/2010/wordml" xmlns:w15="http://schemas.microsoft.com/office/word/2012/wordml" xmlns:w16cex="http://schemas.microsoft.com/office/word/2018/wordml/cex" xmlns:w16cid="http://schemas.microsoft.com/office/word/2016/wordml/cid" xmlns:w16="http://schemas.microsoft.com/office/word/2018/wordml" xmlns:w16du="http://schemas.microsoft.com/office/word/2023/wordml/word16du" xmlns:w16sdtdh="http://schemas.microsoft.com/office/word/2020/wordml/sdtdatahash" xmlns:w16se="http://schemas.microsoft.com/office/word/2015/wordml/symex" xmlns:wpg="http://schemas.microsoft.com/office/word/2010/wordprocessingGroup" xmlns:wpi="http://schemas.microsoft.com/office/word/2010/wordprocessingInk" xmlns:wne="http://schemas.microsoft.com/office/word/2006/wordml" xmlns:wps="http://schemas.microsoft.com/office/word/2010/wordprocessingShape" mc:Ignorable="w14 w15 w16se w16cid w16 w16cex w16sdtdh wp14">
+<w:hdr xmlns:wpc="http://schemas.microsoft.com/office/word/2010/wordprocessingCanvas" xmlns:cx="http://schemas.microsoft.com/office/drawing/2014/chartex" xmlns:cx1="http://schemas.microsoft.com/office/drawing/2015/9/8/chartex" xmlns:cx2="http://schemas.microsoft.com/office/drawing/2015/10/21/chartex" xmlns:cx3="http://schemas.microsoft.com/office/drawing/2016/5/9/chartex" xmlns:cx4="http://schemas.microsoft.com/office/drawing/2016/5/10/chartex" xmlns:cx5="http://schemas.microsoft.com/office/drawing/2016/5/11/chartex" xmlns:cx6="http://schemas.microsoft.com/office/drawing/2016/5/12/chartex" xmlns:cx7="http://schemas.microsoft.com/office/drawing/2016/5/13/chartex" xmlns:cx8="http://schemas.microsoft.com/office/drawing/2016/5/14/chartex" xmlns:mc="http://schemas.openxmlformats.org/markup-compatibility/2006" xmlns:aink="http://schemas.microsoft.com/office/drawing/2016/ink" xmlns:am3d="http://schemas.microsoft.com/office/drawing/2017/model3d" xmlns:o="urn:schemas-microsoft-com:office:office" xmlns:oel="http://schemas.microsoft.com/office/2019/extlst" xmlns:r="http://schemas.openxmlformats.org/officeDocument/2006/relationships" xmlns:m="http://schemas.openxmlformats.org/officeDocument/2006/math" xmlns:v="urn:schemas-microsoft-com:vml" xmlns:wp14="http://schemas.microsoft.com/office/word/2010/wordprocessingDrawing" xmlns:wp="http://schemas.openxmlformats.org/drawingml/2006/wordprocessingDrawing" xmlns:w10="urn:schemas-microsoft-com:office:word" xmlns:w="http://schemas.openxmlformats.org/wordprocessingml/2006/main" xmlns:w14="http://schemas.microsoft.com/office/word/2010/wordml" xmlns:w15="http://schemas.microsoft.com/office/word/2012/wordml" xmlns:w16cex="http://schemas.microsoft.com/office/word/2018/wordml/cex" xmlns:w16cid="http://schemas.microsoft.com/office/word/2016/wordml/cid" xmlns:w16="http://schemas.microsoft.com/office/word/2018/wordml" xmlns:w16du="http://schemas.microsoft.com/office/word/2023/wordml/word16du" xmlns:w16sdtdh="http://schemas.microsoft.com/office/word/2020/wordml/sdtdatahash" xmlns:w16sdtfl="http://schemas.microsoft.com/office/word/2024/wordml/sdtformatlock" xmlns:w16se="http://schemas.microsoft.com/office/word/2015/wordml/symex" xmlns:wpg="http://schemas.microsoft.com/office/word/2010/wordprocessingGroup" xmlns:wpi="http://schemas.microsoft.com/office/word/2010/wordprocessingInk" xmlns:wne="http://schemas.microsoft.com/office/word/2006/wordml" xmlns:wps="http://schemas.microsoft.com/office/word/2010/wordprocessingShape" mc:Ignorable="w14 w15 w16se w16cid w16 w16cex w16sdtdh w16sdtfl w16du wp14">
   <w:p>
     <w:pPr>
       <w:pStyle w:val="Header"/>
       <w:jc w:val="right"/>
     </w:pPr>
-    <w:r xmlns:a="http://schemas.openxmlformats.org/drawingml/2006/main" xmlns:pic="http://schemas.openxmlformats.org/drawingml/2006/picture">
+    <w:r>
       <w:rPr>
         <w:noProof/>
       </w:rPr>
@@ -1849,11 +1451,11 @@
           <wp:effectExtent l="0" t="0" r="0" b="0"/>
           <wp:docPr id="792329633" name="Picture 1"/>
           <wp:cNvGraphicFramePr>
-            <a:graphicFrameLocks noChangeAspect="1"/>
+            <a:graphicFrameLocks xmlns:a="http://schemas.openxmlformats.org/drawingml/2006/main" noChangeAspect="1"/>
           </wp:cNvGraphicFramePr>
-          <a:graphic>
+          <a:graphic xmlns:a="http://schemas.openxmlformats.org/drawingml/2006/main">
             <a:graphicData uri="http://schemas.openxmlformats.org/drawingml/2006/picture">
-              <pic:pic>
+              <pic:pic xmlns:pic="http://schemas.openxmlformats.org/drawingml/2006/picture">
                 <pic:nvPicPr>
                   <pic:cNvPr id="792329633" name=""/>
                   <pic:cNvPicPr/>
@@ -1884,7 +1486,7 @@
 </file>
 
 <file path=word/numbering.xml><?xml version="1.0" encoding="utf-8"?>
-<w:numbering xmlns:wpc="http://schemas.microsoft.com/office/word/2010/wordprocessingCanvas" xmlns:cx="http://schemas.microsoft.com/office/drawing/2014/chartex" xmlns:cx1="http://schemas.microsoft.com/office/drawing/2015/9/8/chartex" xmlns:cx2="http://schemas.microsoft.com/office/drawing/2015/10/21/chartex" xmlns:cx3="http://schemas.microsoft.com/office/drawing/2016/5/9/chartex" xmlns:cx4="http://schemas.microsoft.com/office/drawing/2016/5/10/chartex" xmlns:cx5="http://schemas.microsoft.com/office/drawing/2016/5/11/chartex" xmlns:cx6="http://schemas.microsoft.com/office/drawing/2016/5/12/chartex" xmlns:cx7="http://schemas.microsoft.com/office/drawing/2016/5/13/chartex" xmlns:cx8="http://schemas.microsoft.com/office/drawing/2016/5/14/chartex" xmlns:mc="http://schemas.openxmlformats.org/markup-compatibility/2006" xmlns:aink="http://schemas.microsoft.com/office/drawing/2016/ink" xmlns:am3d="http://schemas.microsoft.com/office/drawing/2017/model3d" xmlns:o="urn:schemas-microsoft-com:office:office" xmlns:oel="http://schemas.microsoft.com/office/2019/extlst" xmlns:r="http://schemas.openxmlformats.org/officeDocument/2006/relationships" xmlns:m="http://schemas.openxmlformats.org/officeDocument/2006/math" xmlns:v="urn:schemas-microsoft-com:vml" xmlns:wp14="http://schemas.microsoft.com/office/word/2010/wordprocessingDrawing" xmlns:wp="http://schemas.openxmlformats.org/drawingml/2006/wordprocessingDrawing" xmlns:w10="urn:schemas-microsoft-com:office:word" xmlns:w="http://schemas.openxmlformats.org/wordprocessingml/2006/main" xmlns:w14="http://schemas.microsoft.com/office/word/2010/wordml" xmlns:w15="http://schemas.microsoft.com/office/word/2012/wordml" xmlns:w16cex="http://schemas.microsoft.com/office/word/2018/wordml/cex" xmlns:w16cid="http://schemas.microsoft.com/office/word/2016/wordml/cid" xmlns:w16="http://schemas.microsoft.com/office/word/2018/wordml" xmlns:w16du="http://schemas.microsoft.com/office/word/2023/wordml/word16du" xmlns:w16sdtdh="http://schemas.microsoft.com/office/word/2020/wordml/sdtdatahash" xmlns:w16se="http://schemas.microsoft.com/office/word/2015/wordml/symex" xmlns:wpg="http://schemas.microsoft.com/office/word/2010/wordprocessingGroup" xmlns:wpi="http://schemas.microsoft.com/office/word/2010/wordprocessingInk" xmlns:wne="http://schemas.microsoft.com/office/word/2006/wordml" xmlns:wps="http://schemas.microsoft.com/office/word/2010/wordprocessingShape" mc:Ignorable="w14 w15 w16se w16cid w16 w16cex w16sdtdh wp14">
+<w:numbering xmlns:wpc="http://schemas.microsoft.com/office/word/2010/wordprocessingCanvas" xmlns:cx="http://schemas.microsoft.com/office/drawing/2014/chartex" xmlns:cx1="http://schemas.microsoft.com/office/drawing/2015/9/8/chartex" xmlns:cx2="http://schemas.microsoft.com/office/drawing/2015/10/21/chartex" xmlns:cx3="http://schemas.microsoft.com/office/drawing/2016/5/9/chartex" xmlns:cx4="http://schemas.microsoft.com/office/drawing/2016/5/10/chartex" xmlns:cx5="http://schemas.microsoft.com/office/drawing/2016/5/11/chartex" xmlns:cx6="http://schemas.microsoft.com/office/drawing/2016/5/12/chartex" xmlns:cx7="http://schemas.microsoft.com/office/drawing/2016/5/13/chartex" xmlns:cx8="http://schemas.microsoft.com/office/drawing/2016/5/14/chartex" xmlns:mc="http://schemas.openxmlformats.org/markup-compatibility/2006" xmlns:aink="http://schemas.microsoft.com/office/drawing/2016/ink" xmlns:am3d="http://schemas.microsoft.com/office/drawing/2017/model3d" xmlns:o="urn:schemas-microsoft-com:office:office" xmlns:oel="http://schemas.microsoft.com/office/2019/extlst" xmlns:r="http://schemas.openxmlformats.org/officeDocument/2006/relationships" xmlns:m="http://schemas.openxmlformats.org/officeDocument/2006/math" xmlns:v="urn:schemas-microsoft-com:vml" xmlns:wp14="http://schemas.microsoft.com/office/word/2010/wordprocessingDrawing" xmlns:wp="http://schemas.openxmlformats.org/drawingml/2006/wordprocessingDrawing" xmlns:w10="urn:schemas-microsoft-com:office:word" xmlns:w="http://schemas.openxmlformats.org/wordprocessingml/2006/main" xmlns:w14="http://schemas.microsoft.com/office/word/2010/wordml" xmlns:w15="http://schemas.microsoft.com/office/word/2012/wordml" xmlns:w16cex="http://schemas.microsoft.com/office/word/2018/wordml/cex" xmlns:w16cid="http://schemas.microsoft.com/office/word/2016/wordml/cid" xmlns:w16="http://schemas.microsoft.com/office/word/2018/wordml" xmlns:w16du="http://schemas.microsoft.com/office/word/2023/wordml/word16du" xmlns:w16sdtdh="http://schemas.microsoft.com/office/word/2020/wordml/sdtdatahash" xmlns:w16sdtfl="http://schemas.microsoft.com/office/word/2024/wordml/sdtformatlock" xmlns:w16se="http://schemas.microsoft.com/office/word/2015/wordml/symex" xmlns:wpg="http://schemas.microsoft.com/office/word/2010/wordprocessingGroup" xmlns:wpi="http://schemas.microsoft.com/office/word/2010/wordprocessingInk" xmlns:wne="http://schemas.microsoft.com/office/word/2006/wordml" xmlns:wps="http://schemas.microsoft.com/office/word/2010/wordprocessingShape" mc:Ignorable="w14 w15 w16se w16cid w16 w16cex w16sdtdh w16sdtfl w16du wp14">
   <w:abstractNum w:abstractNumId="0" w15:restartNumberingAfterBreak="0">
     <w:nsid w:val="096479B8"/>
     <w:multiLevelType w:val="multilevel"/>
@@ -4532,36 +4134,36 @@
       <w:startOverride w:val="1"/>
     </w:lvlOverride>
   </w:num>
-  <w:numIdMacAtCleanup w:val="12"/>
-  <w:num w:numId="20">
+  <w:num w:numId="20" w16cid:durableId="599141220">
     <w:abstractNumId w:val="9"/>
     <w:lvlOverride w:ilvl="0">
       <w:startOverride w:val="1"/>
     </w:lvlOverride>
   </w:num>
-  <w:num w:numId="21">
+  <w:num w:numId="21" w16cid:durableId="1926916729">
     <w:abstractNumId w:val="9"/>
     <w:lvlOverride w:ilvl="0">
       <w:startOverride w:val="1"/>
     </w:lvlOverride>
   </w:num>
-  <w:num w:numId="22">
+  <w:num w:numId="22" w16cid:durableId="107940800">
     <w:abstractNumId w:val="9"/>
     <w:lvlOverride w:ilvl="0">
       <w:startOverride w:val="1"/>
     </w:lvlOverride>
   </w:num>
-  <w:num w:numId="23">
+  <w:num w:numId="23" w16cid:durableId="849874228">
     <w:abstractNumId w:val="8"/>
     <w:lvlOverride w:ilvl="0">
       <w:startOverride w:val="1"/>
     </w:lvlOverride>
   </w:num>
+  <w:numIdMacAtCleanup w:val="12"/>
 </w:numbering>
 </file>
 
 <file path=word/styles.xml><?xml version="1.0" encoding="utf-8"?>
-<w:styles xmlns:mc="http://schemas.openxmlformats.org/markup-compatibility/2006" xmlns:r="http://schemas.openxmlformats.org/officeDocument/2006/relationships" xmlns:w="http://schemas.openxmlformats.org/wordprocessingml/2006/main" xmlns:w14="http://schemas.microsoft.com/office/word/2010/wordml" xmlns:w15="http://schemas.microsoft.com/office/word/2012/wordml" xmlns:w16cex="http://schemas.microsoft.com/office/word/2018/wordml/cex" xmlns:w16cid="http://schemas.microsoft.com/office/word/2016/wordml/cid" xmlns:w16="http://schemas.microsoft.com/office/word/2018/wordml" xmlns:w16sdtdh="http://schemas.microsoft.com/office/word/2020/wordml/sdtdatahash" xmlns:w16se="http://schemas.microsoft.com/office/word/2015/wordml/symex" mc:Ignorable="w14 w15 w16se w16cid w16 w16cex w16sdtdh">
+<w:styles xmlns:mc="http://schemas.openxmlformats.org/markup-compatibility/2006" xmlns:r="http://schemas.openxmlformats.org/officeDocument/2006/relationships" xmlns:w="http://schemas.openxmlformats.org/wordprocessingml/2006/main" xmlns:w14="http://schemas.microsoft.com/office/word/2010/wordml" xmlns:w15="http://schemas.microsoft.com/office/word/2012/wordml" xmlns:w16cex="http://schemas.microsoft.com/office/word/2018/wordml/cex" xmlns:w16cid="http://schemas.microsoft.com/office/word/2016/wordml/cid" xmlns:w16="http://schemas.microsoft.com/office/word/2018/wordml" xmlns:w16du="http://schemas.microsoft.com/office/word/2023/wordml/word16du" xmlns:w16sdtdh="http://schemas.microsoft.com/office/word/2020/wordml/sdtdatahash" xmlns:w16sdtfl="http://schemas.microsoft.com/office/word/2024/wordml/sdtformatlock" xmlns:w16se="http://schemas.microsoft.com/office/word/2015/wordml/symex" mc:Ignorable="w14 w15 w16se w16cid w16 w16cex w16sdtdh w16sdtfl w16du">
   <w:docDefaults>
     <w:rPrDefault>
       <w:rPr>
@@ -6354,25 +5956,6 @@
 </file>
 
 <file path=customXml/item1.xml><?xml version="1.0" encoding="utf-8"?>
-<?mso-contentType ?>
-<FormTemplates xmlns="http://schemas.microsoft.com/sharepoint/v3/contenttype/forms">
-  <Display>DocumentLibraryForm</Display>
-  <Edit>DocumentLibraryForm</Edit>
-  <New>DocumentLibraryForm</New>
-</FormTemplates>
-</file>
-
-<file path=customXml/item2.xml><?xml version="1.0" encoding="utf-8"?>
-<p:properties xmlns:p="http://schemas.microsoft.com/office/2006/metadata/properties" xmlns:xsi="http://www.w3.org/2001/XMLSchema-instance" xmlns:pc="http://schemas.microsoft.com/office/infopath/2007/PartnerControls">
-  <documentManagement/>
-</p:properties>
-</file>
-
-<file path=customXml/item3.xml><?xml version="1.0" encoding="utf-8"?>
-<b:Sources xmlns:b="http://schemas.openxmlformats.org/officeDocument/2006/bibliography" xmlns="http://schemas.openxmlformats.org/officeDocument/2006/bibliography" SelectedStyle="\APA.XSL" StyleName="APA"/>
-</file>
-
-<file path=customXml/item4.xml><?xml version="1.0" encoding="utf-8"?>
 <ct:contentTypeSchema xmlns:ct="http://schemas.microsoft.com/office/2006/metadata/contentType" xmlns:ma="http://schemas.microsoft.com/office/2006/metadata/properties/metaAttributes" ct:_="" ma:_="" ma:contentTypeName="Document" ma:contentTypeID="0x010100C293DE933FF69148B27711FD76D92E04" ma:contentTypeVersion="4" ma:contentTypeDescription="Create a new document." ma:contentTypeScope="" ma:versionID="ae76a2ef7de4af939c14e5b8123e10a7">
   <xsd:schema xmlns:xsd="http://www.w3.org/2001/XMLSchema" xmlns:xs="http://www.w3.org/2001/XMLSchema" xmlns:p="http://schemas.microsoft.com/office/2006/metadata/properties" xmlns:ns2="22575791-b264-44f1-aa59-b18bb77ccb87" targetNamespace="http://schemas.microsoft.com/office/2006/metadata/properties" ma:root="true" ma:fieldsID="ad4b06105965ab86039dfac306eacb6f" ns2:_="">
     <xsd:import namespace="22575791-b264-44f1-aa59-b18bb77ccb87"/>
@@ -6518,32 +6101,26 @@
 </ct:contentTypeSchema>
 </file>
 
-<file path=customXml/itemProps1.xml><?xml version="1.0" encoding="utf-8"?>
-<ds:datastoreItem xmlns:ds="http://schemas.openxmlformats.org/officeDocument/2006/customXml" ds:itemID="{70D0F63B-6151-4634-A6FE-6678201808F0}">
-  <ds:schemaRefs>
-    <ds:schemaRef ds:uri="http://schemas.microsoft.com/sharepoint/v3/contenttype/forms"/>
-  </ds:schemaRefs>
-</ds:datastoreItem>
+<file path=customXml/item2.xml><?xml version="1.0" encoding="utf-8"?>
+<b:Sources xmlns:b="http://schemas.openxmlformats.org/officeDocument/2006/bibliography" xmlns="http://schemas.openxmlformats.org/officeDocument/2006/bibliography" SelectedStyle="\APA.XSL" StyleName="APA"/>
 </file>
 
-<file path=customXml/itemProps2.xml><?xml version="1.0" encoding="utf-8"?>
-<ds:datastoreItem xmlns:ds="http://schemas.openxmlformats.org/officeDocument/2006/customXml" ds:itemID="{C7039DDD-01D7-4A5A-A5B4-812FBF481F06}">
-  <ds:schemaRefs>
-    <ds:schemaRef ds:uri="http://schemas.microsoft.com/office/2006/metadata/properties"/>
-    <ds:schemaRef ds:uri="http://schemas.microsoft.com/office/infopath/2007/PartnerControls"/>
-  </ds:schemaRefs>
-</ds:datastoreItem>
+<file path=customXml/item3.xml><?xml version="1.0" encoding="utf-8"?>
+<p:properties xmlns:p="http://schemas.microsoft.com/office/2006/metadata/properties" xmlns:xsi="http://www.w3.org/2001/XMLSchema-instance" xmlns:pc="http://schemas.microsoft.com/office/infopath/2007/PartnerControls">
+  <documentManagement/>
+</p:properties>
 </file>
 
-<file path=customXml/itemProps3.xml><?xml version="1.0" encoding="utf-8"?>
-<ds:datastoreItem xmlns:ds="http://schemas.openxmlformats.org/officeDocument/2006/customXml" ds:itemID="{D9462DC5-3EF9-46A5-B737-C3B487CEA351}">
-  <ds:schemaRefs>
-    <ds:schemaRef ds:uri="http://schemas.openxmlformats.org/officeDocument/2006/bibliography"/>
-  </ds:schemaRefs>
-</ds:datastoreItem>
+<file path=customXml/item4.xml><?xml version="1.0" encoding="utf-8"?>
+<?mso-contentType ?>
+<FormTemplates xmlns="http://schemas.microsoft.com/sharepoint/v3/contenttype/forms">
+  <Display>DocumentLibraryForm</Display>
+  <Edit>DocumentLibraryForm</Edit>
+  <New>DocumentLibraryForm</New>
+</FormTemplates>
 </file>
 
-<file path=customXml/itemProps4.xml><?xml version="1.0" encoding="utf-8"?>
+<file path=customXml/itemProps1.xml><?xml version="1.0" encoding="utf-8"?>
 <ds:datastoreItem xmlns:ds="http://schemas.openxmlformats.org/officeDocument/2006/customXml" ds:itemID="{9A6D372D-6774-4ABB-A552-C8014F9ACF7C}">
   <ds:schemaRefs>
     <ds:schemaRef ds:uri="http://schemas.microsoft.com/office/2006/metadata/contentType"/>
@@ -6559,4 +6136,29 @@
     <ds:schemaRef ds:uri="http://schemas.microsoft.com/internal/obd"/>
   </ds:schemaRefs>
 </ds:datastoreItem>
+</file>
+
+<file path=customXml/itemProps2.xml><?xml version="1.0" encoding="utf-8"?>
+<ds:datastoreItem xmlns:ds="http://schemas.openxmlformats.org/officeDocument/2006/customXml" ds:itemID="{D9462DC5-3EF9-46A5-B737-C3B487CEA351}">
+  <ds:schemaRefs>
+    <ds:schemaRef ds:uri="http://schemas.openxmlformats.org/officeDocument/2006/bibliography"/>
+  </ds:schemaRefs>
+</ds:datastoreItem>
+</file>
+
+<file path=customXml/itemProps3.xml><?xml version="1.0" encoding="utf-8"?>
+<ds:datastoreItem xmlns:ds="http://schemas.openxmlformats.org/officeDocument/2006/customXml" ds:itemID="{C7039DDD-01D7-4A5A-A5B4-812FBF481F06}">
+  <ds:schemaRefs>
+    <ds:schemaRef ds:uri="http://schemas.microsoft.com/office/2006/metadata/properties"/>
+    <ds:schemaRef ds:uri="http://schemas.microsoft.com/office/infopath/2007/PartnerControls"/>
+  </ds:schemaRefs>
+</ds:datastoreItem>
+</file>
+
+<file path=customXml/itemProps4.xml><?xml version="1.0" encoding="utf-8"?>
+<ds:datastoreItem xmlns:ds="http://schemas.openxmlformats.org/officeDocument/2006/customXml" ds:itemID="{70D0F63B-6151-4634-A6FE-6678201808F0}">
+  <ds:schemaRefs>
+    <ds:schemaRef ds:uri="http://schemas.microsoft.com/sharepoint/v3/contenttype/forms"/>
+  </ds:schemaRefs>
+</ds:datastoreItem>
 </file>
</xml_diff>